<commit_message>
minor changes to code
</commit_message>
<xml_diff>
--- a/Notes - Gio/Research Seminar.docx
+++ b/Notes - Gio/Research Seminar.docx
@@ -77,8 +77,14 @@
           <w:numId w:val="23"/>
         </w:numPr>
         <w:spacing w:after="160" w:line="259" w:lineRule="auto"/>
-      </w:pPr>
-      <w:r>
+        <w:rPr>
+          <w:strike/>
+        </w:rPr>
+      </w:pPr>
+      <w:r>
+        <w:rPr>
+          <w:strike/>
+        </w:rPr>
         <w:t>Include the right macro control variable for GDP per capita</w:t>
       </w:r>
     </w:p>
@@ -90,11 +96,20 @@
           <w:numId w:val="23"/>
         </w:numPr>
         <w:spacing w:after="160" w:line="259" w:lineRule="auto"/>
-      </w:pPr>
-      <w:r>
+        <w:rPr>
+          <w:strike/>
+        </w:rPr>
+      </w:pPr>
+      <w:r>
+        <w:rPr>
+          <w:strike/>
+        </w:rPr>
         <w:t xml:space="preserve">Potentially: Prepare age_85 </w:t>
       </w:r>
       <w:r>
+        <w:rPr>
+          <w:strike/>
+        </w:rPr>
         <w:t>control variable</w:t>
       </w:r>
     </w:p>
@@ -120,10 +135,6 @@
           <w:numId w:val="24"/>
         </w:numPr>
         <w:spacing w:after="160" w:line="259" w:lineRule="auto"/>
-        <w:rPr>
-          <w:b/>
-          <w:bCs/>
-        </w:rPr>
       </w:pPr>
       <w:r>
         <w:rPr>
@@ -132,6 +143,21 @@
         </w:rPr>
         <w:t>Run regression to find final specification</w:t>
       </w:r>
+      <w:r>
+        <w:rPr>
+          <w:b/>
+          <w:bCs/>
+        </w:rPr>
+        <w:t xml:space="preserve"> - </w:t>
+      </w:r>
+      <w:hyperlink r:id="rId5">
+        <w:r>
+          <w:rPr>
+            <w:rStyle w:val="Hyperlink"/>
+          </w:rPr>
+          <w:t>https://universitaetstgallen-my.sharepoint.com/:p:/r/personal/giovanni_brenni_student_unisg_ch/_layouts/15/Doc.aspx?sourcedoc=%7BF22FB709-D736-4D8B-99B0-10FA66E01850%7D&amp;file=Research%20Seminar_Discussion%20File_v1.pptx&amp;action=edit&amp;mobileredirect=true</w:t>
+        </w:r>
+      </w:hyperlink>
     </w:p>
     <w:p>
       <w:pPr>
@@ -154,9 +180,27 @@
           <w:numId w:val="23"/>
         </w:numPr>
         <w:spacing w:after="160" w:line="259" w:lineRule="auto"/>
-      </w:pPr>
-      <w:r>
+        <w:rPr>
+          <w:color w:val="ED7D31" w:themeColor="accent2"/>
+        </w:rPr>
+      </w:pPr>
+      <w:r>
+        <w:rPr>
+          <w:color w:val="ED7D31" w:themeColor="accent2"/>
+        </w:rPr>
         <w:t>Run it for EU27 + CH only, but cluster by Country_Region</w:t>
+      </w:r>
+      <w:r>
+        <w:rPr>
+          <w:color w:val="ED7D31" w:themeColor="accent2"/>
+        </w:rPr>
+        <w:t xml:space="preserve"> instead of Country</w:t>
+      </w:r>
+      <w:r>
+        <w:rPr>
+          <w:color w:val="ED7D31" w:themeColor="accent2"/>
+        </w:rPr>
+        <w:t xml:space="preserve"> -&gt; GB</w:t>
       </w:r>
     </w:p>
     <w:p>
@@ -167,9 +211,39 @@
           <w:numId w:val="23"/>
         </w:numPr>
         <w:spacing w:after="160" w:line="259" w:lineRule="auto"/>
-      </w:pPr>
-      <w:r>
-        <w:t>Run it for Saving Banks only</w:t>
+        <w:rPr>
+          <w:color w:val="ED7D31" w:themeColor="accent2"/>
+        </w:rPr>
+      </w:pPr>
+      <w:r>
+        <w:rPr>
+          <w:color w:val="ED7D31" w:themeColor="accent2"/>
+        </w:rPr>
+        <w:t xml:space="preserve">Run it for </w:t>
+      </w:r>
+      <w:r>
+        <w:rPr>
+          <w:color w:val="ED7D31" w:themeColor="accent2"/>
+        </w:rPr>
+        <w:t>all 43 countries</w:t>
+      </w:r>
+      <w:r>
+        <w:rPr>
+          <w:color w:val="ED7D31" w:themeColor="accent2"/>
+        </w:rPr>
+        <w:t>, but cluster by Country_Region</w:t>
+      </w:r>
+      <w:r>
+        <w:rPr>
+          <w:color w:val="ED7D31" w:themeColor="accent2"/>
+        </w:rPr>
+        <w:t xml:space="preserve"> instead of Country</w:t>
+      </w:r>
+      <w:r>
+        <w:rPr>
+          <w:color w:val="ED7D31" w:themeColor="accent2"/>
+        </w:rPr>
+        <w:t xml:space="preserve"> -&gt; GB</w:t>
       </w:r>
     </w:p>
     <w:p>
@@ -180,9 +254,21 @@
           <w:numId w:val="23"/>
         </w:numPr>
         <w:spacing w:after="160" w:line="259" w:lineRule="auto"/>
-      </w:pPr>
-      <w:r>
+        <w:rPr>
+          <w:color w:val="ED7D31" w:themeColor="accent2"/>
+        </w:rPr>
+      </w:pPr>
+      <w:r>
+        <w:rPr>
+          <w:color w:val="ED7D31" w:themeColor="accent2"/>
+        </w:rPr>
         <w:t>Run it step-by-step bottom-up to include more countries</w:t>
+      </w:r>
+      <w:r>
+        <w:rPr>
+          <w:color w:val="ED7D31" w:themeColor="accent2"/>
+        </w:rPr>
+        <w:t xml:space="preserve"> -&gt; GB</w:t>
       </w:r>
     </w:p>
     <w:p>
@@ -193,9 +279,21 @@
           <w:numId w:val="23"/>
         </w:numPr>
         <w:spacing w:after="160" w:line="259" w:lineRule="auto"/>
-      </w:pPr>
-      <w:r>
+        <w:rPr>
+          <w:color w:val="70AD47" w:themeColor="accent6"/>
+        </w:rPr>
+      </w:pPr>
+      <w:r>
+        <w:rPr>
+          <w:color w:val="70AD47" w:themeColor="accent6"/>
+        </w:rPr>
         <w:t>Split by financial system type and run wild-cluster bootstrap for both due to small sample bias</w:t>
+      </w:r>
+      <w:r>
+        <w:rPr>
+          <w:color w:val="70AD47" w:themeColor="accent6"/>
+        </w:rPr>
+        <w:t xml:space="preserve"> -&gt; Alex</w:t>
       </w:r>
     </w:p>
     <w:p>
@@ -206,12 +304,27 @@
           <w:numId w:val="23"/>
         </w:numPr>
         <w:spacing w:after="160" w:line="259" w:lineRule="auto"/>
-      </w:pPr>
-      <w:r>
-        <w:t xml:space="preserve">Potentially: Aggregate </w:t>
-      </w:r>
-      <w:r>
-        <w:t>by country and run regression model again</w:t>
+        <w:rPr>
+          <w:color w:val="70AD47" w:themeColor="accent6"/>
+        </w:rPr>
+      </w:pPr>
+      <w:r>
+        <w:rPr>
+          <w:color w:val="70AD47" w:themeColor="accent6"/>
+        </w:rPr>
+        <w:t>Age 85 – run the regression as alternative of H1</w:t>
+      </w:r>
+      <w:r>
+        <w:rPr>
+          <w:color w:val="70AD47" w:themeColor="accent6"/>
+        </w:rPr>
+        <w:t>, potentially think of different specification</w:t>
+      </w:r>
+      <w:r>
+        <w:rPr>
+          <w:color w:val="70AD47" w:themeColor="accent6"/>
+        </w:rPr>
+        <w:t xml:space="preserve"> -&gt; Alex</w:t>
       </w:r>
     </w:p>
     <w:p>
@@ -222,35 +335,94 @@
           <w:numId w:val="23"/>
         </w:numPr>
         <w:spacing w:after="160" w:line="259" w:lineRule="auto"/>
-      </w:pPr>
-      <w:r>
-        <w:rPr>
-          <w:b/>
-          <w:bCs/>
-          <w:i/>
-          <w:iCs/>
-        </w:rPr>
-        <w:t>Define:</w:t>
-      </w:r>
-      <w:r>
-        <w:t xml:space="preserve"> </w:t>
-      </w:r>
-      <w:r>
-        <w:t>What are our key Hypotheses</w:t>
-      </w:r>
-      <w:r>
-        <w:t xml:space="preserve"> that are tested?</w:t>
+        <w:rPr>
+          <w:color w:val="7030A0"/>
+        </w:rPr>
+      </w:pPr>
+      <w:r>
+        <w:rPr>
+          <w:color w:val="7030A0"/>
+        </w:rPr>
+        <w:t>Run it for Saving Banks only</w:t>
+      </w:r>
+      <w:r>
+        <w:rPr>
+          <w:color w:val="7030A0"/>
+        </w:rPr>
+        <w:t xml:space="preserve"> -&gt; NB</w:t>
       </w:r>
     </w:p>
     <w:p>
       <w:pPr>
         <w:pStyle w:val="ListParagraph"/>
         <w:numPr>
-          <w:ilvl w:val="2"/>
+          <w:ilvl w:val="1"/>
           <w:numId w:val="23"/>
         </w:numPr>
         <w:spacing w:after="160" w:line="259" w:lineRule="auto"/>
-      </w:pPr>
+        <w:rPr>
+          <w:color w:val="7030A0"/>
+        </w:rPr>
+      </w:pPr>
+      <w:r>
+        <w:rPr>
+          <w:color w:val="7030A0"/>
+        </w:rPr>
+        <w:t xml:space="preserve">Potentially: Aggregate </w:t>
+      </w:r>
+      <w:r>
+        <w:rPr>
+          <w:color w:val="7030A0"/>
+        </w:rPr>
+        <w:t>by country and run regression model again</w:t>
+      </w:r>
+      <w:r>
+        <w:rPr>
+          <w:color w:val="7030A0"/>
+        </w:rPr>
+        <w:t xml:space="preserve"> -&gt; NB</w:t>
+      </w:r>
+    </w:p>
+    <w:p>
+      <w:pPr>
+        <w:pStyle w:val="ListParagraph"/>
+        <w:numPr>
+          <w:ilvl w:val="1"/>
+          <w:numId w:val="23"/>
+        </w:numPr>
+        <w:spacing w:after="160" w:line="259" w:lineRule="auto"/>
+      </w:pPr>
+      <w:r>
+        <w:t>Include VIF, Heckman tests</w:t>
+      </w:r>
+    </w:p>
+    <w:p>
+      <w:pPr>
+        <w:pStyle w:val="ListParagraph"/>
+        <w:numPr>
+          <w:ilvl w:val="1"/>
+          <w:numId w:val="23"/>
+        </w:numPr>
+        <w:spacing w:after="160" w:line="259" w:lineRule="auto"/>
+      </w:pPr>
+      <w:r>
+        <w:rPr>
+          <w:b/>
+          <w:bCs/>
+          <w:i/>
+          <w:iCs/>
+        </w:rPr>
+        <w:t>Define:</w:t>
+      </w:r>
+      <w:r>
+        <w:t xml:space="preserve"> </w:t>
+      </w:r>
+      <w:r>
+        <w:t>What are our key Hypotheses</w:t>
+      </w:r>
+      <w:r>
+        <w:t xml:space="preserve"> that are tested?</w:t>
+      </w:r>
     </w:p>
     <w:p>
       <w:pPr>
@@ -282,6 +454,217 @@
           <w:bCs/>
         </w:rPr>
       </w:pPr>
+      <w:r>
+        <w:rPr>
+          <w:b/>
+          <w:bCs/>
+        </w:rPr>
+        <w:t>H1: Demographic Ageing and Deposit Ratios</w:t>
+      </w:r>
+    </w:p>
+    <w:p>
+      <w:r>
+        <w:t>A higher share of the population aged 65 and above is positively associated with the deposit ratio across countries.</w:t>
+      </w:r>
+    </w:p>
+    <w:p>
+      <w:pPr>
+        <w:rPr>
+          <w:b/>
+          <w:bCs/>
+        </w:rPr>
+      </w:pPr>
+    </w:p>
+    <w:p>
+      <w:pPr>
+        <w:rPr>
+          <w:b/>
+          <w:bCs/>
+        </w:rPr>
+      </w:pPr>
+      <w:r>
+        <w:rPr>
+          <w:b/>
+          <w:bCs/>
+        </w:rPr>
+        <w:t>H2: The Moderating Role of Financial System Structure</w:t>
+      </w:r>
+    </w:p>
+    <w:p>
+      <w:r>
+        <w:t>The positive association between the share of the population aged 65 and above and the deposit ratio is stronger in bank-based financial systems than in market-based financial systems.</w:t>
+      </w:r>
+    </w:p>
+    <w:p>
+      <w:pPr>
+        <w:rPr>
+          <w:b/>
+          <w:bCs/>
+        </w:rPr>
+      </w:pPr>
+    </w:p>
+    <w:p>
+      <w:pPr>
+        <w:rPr>
+          <w:b/>
+          <w:bCs/>
+        </w:rPr>
+      </w:pPr>
+      <w:r>
+        <w:rPr>
+          <w:b/>
+          <w:bCs/>
+        </w:rPr>
+        <w:t>H3: The Distinct Effect of the Oldest</w:t>
+      </w:r>
+    </w:p>
+    <w:p>
+      <w:commentRangeStart w:id="0"/>
+      <w:r>
+        <w:t>The positive association between the share of the population aged 85 and above and the deposit ratio is stronger than that of the share of the population aged 65 and above.</w:t>
+      </w:r>
+      <w:commentRangeEnd w:id="0"/>
+      <w:r>
+        <w:rPr>
+          <w:rStyle w:val="CommentReference"/>
+          <w:sz w:val="24"/>
+          <w:szCs w:val="24"/>
+        </w:rPr>
+        <w:commentReference w:id="0"/>
+      </w:r>
+    </w:p>
+    <w:p/>
+    <w:p>
+      <w:pPr>
+        <w:rPr>
+          <w:b/>
+          <w:bCs/>
+        </w:rPr>
+      </w:pPr>
+      <w:r>
+        <w:rPr>
+          <w:b/>
+          <w:bCs/>
+        </w:rPr>
+        <w:t>Key points identified in last session:</w:t>
+      </w:r>
+    </w:p>
+    <w:p>
+      <w:pPr>
+        <w:pStyle w:val="ListParagraph"/>
+        <w:numPr>
+          <w:ilvl w:val="0"/>
+          <w:numId w:val="26"/>
+        </w:numPr>
+      </w:pPr>
+      <w:r>
+        <w:t>Regression should be specified cross-sectional (time FE only</w:t>
+      </w:r>
+      <w:r>
+        <w:t>, no bank FE)</w:t>
+      </w:r>
+      <w:r>
+        <w:t xml:space="preserve"> as our explanatory variables (e.g., share 65+, financial structure, …) are moving slowly over time</w:t>
+      </w:r>
+    </w:p>
+    <w:p>
+      <w:pPr>
+        <w:pStyle w:val="ListParagraph"/>
+        <w:numPr>
+          <w:ilvl w:val="0"/>
+          <w:numId w:val="26"/>
+        </w:numPr>
+      </w:pPr>
+      <w:r>
+        <w:t>The number of clusters should be increased</w:t>
+      </w:r>
+      <w:r>
+        <w:t xml:space="preserve"> either by increasing number of countries or sub-country clusters to avoid biased standard errors</w:t>
+      </w:r>
+    </w:p>
+    <w:p>
+      <w:pPr>
+        <w:pStyle w:val="ListParagraph"/>
+        <w:numPr>
+          <w:ilvl w:val="0"/>
+          <w:numId w:val="26"/>
+        </w:numPr>
+      </w:pPr>
+      <w:r>
+        <w:t>Bank controls (size, profitability, …)</w:t>
+      </w:r>
+      <w:r>
+        <w:t xml:space="preserve"> should be in</w:t>
+      </w:r>
+      <w:r>
+        <w:t>cluded</w:t>
+      </w:r>
+      <w:r>
+        <w:t xml:space="preserve"> in addition to macro controls</w:t>
+      </w:r>
+    </w:p>
+    <w:p/>
+    <w:p>
+      <w:pPr>
+        <w:rPr>
+          <w:b/>
+          <w:bCs/>
+        </w:rPr>
+      </w:pPr>
+      <w:r>
+        <w:rPr>
+          <w:b/>
+          <w:bCs/>
+        </w:rPr>
+        <w:t>Key challenges after implementing exactly these changes:</w:t>
+      </w:r>
+    </w:p>
+    <w:p>
+      <w:pPr>
+        <w:pStyle w:val="ListParagraph"/>
+        <w:numPr>
+          <w:ilvl w:val="0"/>
+          <w:numId w:val="27"/>
+        </w:numPr>
+      </w:pPr>
+      <w:r>
+        <w:t xml:space="preserve">We find no significance for any </w:t>
+      </w:r>
+      <w:r>
+        <w:t>of our hypotheses, for H1 not even directional support</w:t>
+      </w:r>
+    </w:p>
+    <w:p>
+      <w:pPr>
+        <w:rPr>
+          <w:b/>
+          <w:bCs/>
+        </w:rPr>
+      </w:pPr>
+      <w:r>
+        <w:rPr>
+          <w:b/>
+          <w:bCs/>
+        </w:rPr>
+        <w:t>Ask:</w:t>
+      </w:r>
+    </w:p>
+    <w:p>
+      <w:pPr>
+        <w:pStyle w:val="ListParagraph"/>
+        <w:numPr>
+          <w:ilvl w:val="0"/>
+          <w:numId w:val="27"/>
+        </w:numPr>
+      </w:pPr>
+    </w:p>
+    <w:p>
+      <w:pPr>
+        <w:rPr>
+          <w:b/>
+          <w:bCs/>
+        </w:rPr>
+      </w:pPr>
     </w:p>
     <w:p>
       <w:pPr>
@@ -311,7 +694,7 @@
       <w:r>
         <w:t xml:space="preserve">Merging procedure: </w:t>
       </w:r>
-      <w:hyperlink r:id="rId5">
+      <w:hyperlink r:id="rId10">
         <w:r>
           <w:rPr>
             <w:rStyle w:val="Hyperlink"/>
@@ -333,7 +716,23 @@
         <w:t xml:space="preserve"> idea is to create a new column called “Country_Region”, where we add a new variable consisting of the country and the regio</w:t>
       </w:r>
       <w:r>
-        <w:t>n (format country_region, ex. USA_New York) if the region is available, otherwise just the country (ex. Finland --&gt; Finland)</w:t>
+        <w:t xml:space="preserve">n (format </w:t>
+      </w:r>
+      <w:proofErr w:type="spellStart"/>
+      <w:r>
+        <w:t>country_region</w:t>
+      </w:r>
+      <w:proofErr w:type="spellEnd"/>
+      <w:r>
+        <w:t xml:space="preserve">, ex. </w:t>
+      </w:r>
+      <w:proofErr w:type="spellStart"/>
+      <w:r>
+        <w:t>USA_New</w:t>
+      </w:r>
+      <w:proofErr w:type="spellEnd"/>
+      <w:r>
+        <w:t xml:space="preserve"> York) if the region is available, otherwise just the country (ex. Finland --&gt; Finland)</w:t>
       </w:r>
       <w:r>
         <w:t xml:space="preserve"> - we only do it for Germany and USA.</w:t>
@@ -468,12 +867,21 @@
     <w:p/>
     <w:p/>
     <w:p>
-      <w:r>
-        <w:rPr>
-          <w:b/>
-          <w:bCs/>
-        </w:rPr>
-        <w:t>FinStucture &amp; Age65</w:t>
+      <w:proofErr w:type="spellStart"/>
+      <w:r>
+        <w:rPr>
+          <w:b/>
+          <w:bCs/>
+        </w:rPr>
+        <w:t>FinStucture</w:t>
+      </w:r>
+      <w:proofErr w:type="spellEnd"/>
+      <w:r>
+        <w:rPr>
+          <w:b/>
+          <w:bCs/>
+        </w:rPr>
+        <w:t xml:space="preserve"> &amp; Age65</w:t>
       </w:r>
       <w:r>
         <w:t>: expanding dataset with FinStructure and Age65 variables for OECD countries (excluding already existing EU27+CH)</w:t>
@@ -527,13 +935,37 @@
         <w:t xml:space="preserve">Take variables: </w:t>
       </w:r>
       <w:r>
-        <w:t xml:space="preserve">“mktcap_pct_gdp”, “pvcredit_pct_gdp”, “FinStructure”, “pop65_pct” and merge </w:t>
+        <w:t>“</w:t>
+      </w:r>
+      <w:proofErr w:type="spellStart"/>
+      <w:r>
+        <w:t>mktcap_pct_gdp</w:t>
+      </w:r>
+      <w:proofErr w:type="spellEnd"/>
+      <w:r>
+        <w:t>”, “</w:t>
+      </w:r>
+      <w:proofErr w:type="spellStart"/>
+      <w:r>
+        <w:t>pvcredit_pct_gdp</w:t>
+      </w:r>
+      <w:proofErr w:type="spellEnd"/>
+      <w:r>
+        <w:t xml:space="preserve">”, “FinStructure”, “pop65_pct” and merge </w:t>
       </w:r>
       <w:r>
         <w:t xml:space="preserve">with dataset on </w:t>
       </w:r>
       <w:r>
-        <w:t>“SP_COUNTRY_NAME” and “fiscal_year”</w:t>
+        <w:t>“SP_COUNTRY_NAME” and “</w:t>
+      </w:r>
+      <w:proofErr w:type="spellStart"/>
+      <w:r>
+        <w:t>fiscal_year</w:t>
+      </w:r>
+      <w:proofErr w:type="spellEnd"/>
+      <w:r>
+        <w:t>”</w:t>
       </w:r>
     </w:p>
     <w:p/>
@@ -728,6 +1160,7 @@
           <w:lang w:val="en-GB"/>
         </w:rPr>
       </w:pPr>
+      <w:proofErr w:type="spellStart"/>
       <w:r>
         <w:rPr>
           <w:strike/>
@@ -735,6 +1168,7 @@
         </w:rPr>
         <w:t>FinDevelopment</w:t>
       </w:r>
+      <w:proofErr w:type="spellEnd"/>
     </w:p>
     <w:p>
       <w:pPr>
@@ -1011,9 +1445,29 @@
           <w:iCs/>
           <w:color w:val="808080" w:themeColor="background1" w:themeShade="80"/>
         </w:rPr>
-        <w:t xml:space="preserve">Market capitalisation (CM.MKT.LCAP.GD.ZS): </w:t>
-      </w:r>
-      <w:hyperlink r:id="rId6">
+        <w:t xml:space="preserve">Market </w:t>
+      </w:r>
+      <w:proofErr w:type="spellStart"/>
+      <w:r>
+        <w:rPr>
+          <w:rFonts w:ascii="Calibri" w:eastAsia="Calibri" w:hAnsi="Calibri" w:cs="Arial"/>
+          <w:i/>
+          <w:iCs/>
+          <w:color w:val="808080" w:themeColor="background1" w:themeShade="80"/>
+        </w:rPr>
+        <w:t>capitalisation</w:t>
+      </w:r>
+      <w:proofErr w:type="spellEnd"/>
+      <w:r>
+        <w:rPr>
+          <w:rFonts w:ascii="Calibri" w:eastAsia="Calibri" w:hAnsi="Calibri" w:cs="Arial"/>
+          <w:i/>
+          <w:iCs/>
+          <w:color w:val="808080" w:themeColor="background1" w:themeShade="80"/>
+        </w:rPr>
+        <w:t xml:space="preserve"> (CM.MKT.LCAP.GD.ZS): </w:t>
+      </w:r>
+      <w:hyperlink r:id="rId11">
         <w:r>
           <w:rPr>
             <w:rStyle w:val="Hyperlink"/>
@@ -1048,7 +1502,7 @@
         </w:rPr>
         <w:t xml:space="preserve">Private credit by banks (FD.AST.PRVT.GD.ZS): </w:t>
       </w:r>
-      <w:hyperlink r:id="rId7">
+      <w:hyperlink r:id="rId12">
         <w:r>
           <w:rPr>
             <w:rStyle w:val="Hyperlink"/>
@@ -1104,9 +1558,29 @@
           <w:iCs/>
           <w:color w:val="808080" w:themeColor="background1" w:themeShade="80"/>
         </w:rPr>
-        <w:t xml:space="preserve">Market capitalisation (listed shares): </w:t>
-      </w:r>
-      <w:hyperlink r:id="rId8">
+        <w:t xml:space="preserve">Market </w:t>
+      </w:r>
+      <w:proofErr w:type="spellStart"/>
+      <w:r>
+        <w:rPr>
+          <w:rFonts w:ascii="Calibri" w:eastAsia="Calibri" w:hAnsi="Calibri" w:cs="Arial"/>
+          <w:i/>
+          <w:iCs/>
+          <w:color w:val="808080" w:themeColor="background1" w:themeShade="80"/>
+        </w:rPr>
+        <w:t>capitalisation</w:t>
+      </w:r>
+      <w:proofErr w:type="spellEnd"/>
+      <w:r>
+        <w:rPr>
+          <w:rFonts w:ascii="Calibri" w:eastAsia="Calibri" w:hAnsi="Calibri" w:cs="Arial"/>
+          <w:i/>
+          <w:iCs/>
+          <w:color w:val="808080" w:themeColor="background1" w:themeShade="80"/>
+        </w:rPr>
+        <w:t xml:space="preserve"> (listed shares): </w:t>
+      </w:r>
+      <w:hyperlink r:id="rId13">
         <w:r>
           <w:rPr>
             <w:rStyle w:val="Hyperlink"/>
@@ -1164,7 +1638,7 @@
         </w:rPr>
         <w:t xml:space="preserve">GDP and main components (nama_10_gdp): </w:t>
       </w:r>
-      <w:hyperlink r:id="rId9">
+      <w:hyperlink r:id="rId14">
         <w:r>
           <w:rPr>
             <w:rStyle w:val="Hyperlink"/>
@@ -1222,7 +1696,7 @@
         </w:rPr>
         <w:t xml:space="preserve">Switzerland — private credit by banks 2017–2024: </w:t>
       </w:r>
-      <w:hyperlink r:id="rId10">
+      <w:hyperlink r:id="rId15">
         <w:r>
           <w:rPr>
             <w:rStyle w:val="Hyperlink"/>
@@ -1278,9 +1752,29 @@
           <w:iCs/>
           <w:color w:val="808080" w:themeColor="background1" w:themeShade="80"/>
         </w:rPr>
-        <w:t xml:space="preserve">Sweden — market capitalisation % of GDP: </w:t>
-      </w:r>
-      <w:hyperlink r:id="rId11">
+        <w:t xml:space="preserve">Sweden — market </w:t>
+      </w:r>
+      <w:proofErr w:type="spellStart"/>
+      <w:r>
+        <w:rPr>
+          <w:rFonts w:ascii="Calibri" w:eastAsia="Calibri" w:hAnsi="Calibri" w:cs="Arial"/>
+          <w:i/>
+          <w:iCs/>
+          <w:color w:val="808080" w:themeColor="background1" w:themeShade="80"/>
+        </w:rPr>
+        <w:t>capitalisation</w:t>
+      </w:r>
+      <w:proofErr w:type="spellEnd"/>
+      <w:r>
+        <w:rPr>
+          <w:rFonts w:ascii="Calibri" w:eastAsia="Calibri" w:hAnsi="Calibri" w:cs="Arial"/>
+          <w:i/>
+          <w:iCs/>
+          <w:color w:val="808080" w:themeColor="background1" w:themeShade="80"/>
+        </w:rPr>
+        <w:t xml:space="preserve"> % of GDP: </w:t>
+      </w:r>
+      <w:hyperlink r:id="rId16">
         <w:r>
           <w:rPr>
             <w:rStyle w:val="Hyperlink"/>
@@ -1304,11 +1798,44 @@
     </w:p>
     <w:p>
       <w:r>
-        <w:t>The FinStructure variable is constructed following Levine (2002) as the natural logarithm of the ratio of stock market capitalisation to private credit by banks, both expressed as a percentage of GDP, with a (1+) adjustment in numerator and denominator to ensure the log is well-defined. The primary data source is the World Bank's World Development Indicators (indicators CM.MKT.LCAP.GD.ZS and FD.AST.PRVT.GD.ZS). Where World Bank data is unavailable for recent years, we supplement with data from the ECB Statistical Data Warehouse for market capitalisation — dividing absolute values by nominal GDP from Eurostat (nama_10_gdp) to obtain percentage of GDP figures — from the BIS Total Credit Statistics for Swiss private credit over 2017–2024 (Credit from Banks, domestic to Private non-financial sector, percentage of GDP, adjusted for breaks), and from Nasdaq OMX Stockholm for Swedish market capitalisation as a percentage of nominal GDP. As the BIS series exhibits a systematic level difference relative to the World Bank in overlapping years, a correction factor equal to the average gap is applied. Ireland is excluded due to large discrepancies between World Bank and ECB market capitalisation figures, attributable to well-known multinational distortions in Irish national accounts. EU member states not covered by either source are also excluded. The resulting panel is unbalanced.</w:t>
+        <w:t xml:space="preserve">The FinStructure variable is constructed following Levine (2002) as the natural logarithm of the ratio of stock market </w:t>
+      </w:r>
+      <w:proofErr w:type="spellStart"/>
+      <w:r>
+        <w:t>capitalisation</w:t>
+      </w:r>
+      <w:proofErr w:type="spellEnd"/>
+      <w:r>
+        <w:t xml:space="preserve"> to private credit by banks, both expressed as a percentage of GDP, with a (1+) adjustment in numerator and denominator to ensure the log is well-defined. The primary data source is the World Bank's World Development Indicators (indicators CM.MKT.LCAP.GD.ZS and FD.AST.PRVT.GD.ZS). Where World Bank data is unavailable for recent years, we supplement with data from the ECB Statistical Data Warehouse for market </w:t>
+      </w:r>
+      <w:proofErr w:type="spellStart"/>
+      <w:r>
+        <w:t>capitalisation</w:t>
+      </w:r>
+      <w:proofErr w:type="spellEnd"/>
+      <w:r>
+        <w:t xml:space="preserve"> — dividing absolute values by nominal GDP from Eurostat (nama_10_gdp) to obtain percentage of GDP figures — from the BIS Total Credit Statistics for Swiss private credit over 2017–2024 (Credit from Banks, domestic to Private non-financial sector, percentage of GDP, adjusted for breaks), and from Nasdaq OMX Stockholm for Swedish market </w:t>
+      </w:r>
+      <w:proofErr w:type="spellStart"/>
+      <w:r>
+        <w:t>capitalisation</w:t>
+      </w:r>
+      <w:proofErr w:type="spellEnd"/>
+      <w:r>
+        <w:t xml:space="preserve"> as a percentage of nominal GDP. As the BIS series exhibits a systematic level difference relative to the World Bank in overlapping years, a correction factor equal to the average gap is applied. Ireland is excluded due to large discrepancies between World Bank and ECB market </w:t>
+      </w:r>
+      <w:proofErr w:type="spellStart"/>
+      <w:r>
+        <w:t>capitalisation</w:t>
+      </w:r>
+      <w:proofErr w:type="spellEnd"/>
+      <w:r>
+        <w:t xml:space="preserve"> figures, attributable to well-known multinational distortions in Irish national accounts. EU member states not covered by either source are also excluded. The resulting panel is unbalanced.</w:t>
       </w:r>
     </w:p>
     <w:p/>
     <w:p>
+      <w:proofErr w:type="spellStart"/>
       <w:r>
         <w:rPr>
           <w:b/>
@@ -1316,7 +1843,17 @@
           <w:color w:val="FF0000"/>
           <w:u w:val="single"/>
         </w:rPr>
-        <w:t>PensionSystemClassification:</w:t>
+        <w:t>PensionSystemClassification</w:t>
+      </w:r>
+      <w:proofErr w:type="spellEnd"/>
+      <w:r>
+        <w:rPr>
+          <w:b/>
+          <w:bCs/>
+          <w:color w:val="FF0000"/>
+          <w:u w:val="single"/>
+        </w:rPr>
+        <w:t>:</w:t>
       </w:r>
       <w:r>
         <w:rPr>
@@ -1330,12 +1867,72 @@
           <w:iCs/>
           <w:color w:val="A6A6A6" w:themeColor="background1" w:themeShade="A6"/>
         </w:rPr>
-        <w:t>With Denmark and Ireland excluded, the Beveridgean group shrinks to only 3 countries (Finland, Sweden, Netherlands), making it difficult to precisely identify a separate coefficient. A single Bismarckian dummy (1 = Bismarckian, 0 = otherwise) would be statistically more robust. Worth discussing with the group whether the Beveridgean vs Multipillar distinction is theoretically important enough to justify keeping two dummies</w:t>
-      </w:r>
-    </w:p>
-    <w:p>
-      <w:r>
-        <w:t>Pension systems are classified following Ebbinghaus (2021), Werding (2003), and OECD Pensions at a Glance (2024) into three categories: Bismarckian systems (earnings-related, contribution-based, dominant in Continental and Southern Europe), Beveridgean systems (flat-rate, universal, tax-funded, dominant in Nordic countries), and Multipillar/Mixed systems (combination of public mandatory and private funded pillars). We encode this classification using two dummy variables — Bismarckian and Beveridgean — with Multipillar as the baseline category.</w:t>
+        <w:t xml:space="preserve">With Denmark and Ireland excluded, the </w:t>
+      </w:r>
+      <w:proofErr w:type="spellStart"/>
+      <w:r>
+        <w:rPr>
+          <w:i/>
+          <w:iCs/>
+          <w:color w:val="A6A6A6" w:themeColor="background1" w:themeShade="A6"/>
+        </w:rPr>
+        <w:t>Beveridgean</w:t>
+      </w:r>
+      <w:proofErr w:type="spellEnd"/>
+      <w:r>
+        <w:rPr>
+          <w:i/>
+          <w:iCs/>
+          <w:color w:val="A6A6A6" w:themeColor="background1" w:themeShade="A6"/>
+        </w:rPr>
+        <w:t xml:space="preserve"> group shrinks to only 3 countries (Finland, Sweden, Netherlands), making it difficult to precisely identify a separate coefficient. A single Bismarckian dummy (1 = Bismarckian, 0 = otherwise) would be statistically more robust. Worth discussing with the group whether the </w:t>
+      </w:r>
+      <w:proofErr w:type="spellStart"/>
+      <w:r>
+        <w:rPr>
+          <w:i/>
+          <w:iCs/>
+          <w:color w:val="A6A6A6" w:themeColor="background1" w:themeShade="A6"/>
+        </w:rPr>
+        <w:t>Beveridgean</w:t>
+      </w:r>
+      <w:proofErr w:type="spellEnd"/>
+      <w:r>
+        <w:rPr>
+          <w:i/>
+          <w:iCs/>
+          <w:color w:val="A6A6A6" w:themeColor="background1" w:themeShade="A6"/>
+        </w:rPr>
+        <w:t xml:space="preserve"> vs Multipillar distinction is theoretically important enough to justify keeping two dummies</w:t>
+      </w:r>
+    </w:p>
+    <w:p>
+      <w:r>
+        <w:t xml:space="preserve">Pension systems are classified following Ebbinghaus (2021), </w:t>
+      </w:r>
+      <w:proofErr w:type="spellStart"/>
+      <w:r>
+        <w:t>Werding</w:t>
+      </w:r>
+      <w:proofErr w:type="spellEnd"/>
+      <w:r>
+        <w:t xml:space="preserve"> (2003), and OECD Pensions at a Glance (2024) into three categories: Bismarckian systems (earnings-related, contribution-based, dominant in Continental and Southern Europe), </w:t>
+      </w:r>
+      <w:proofErr w:type="spellStart"/>
+      <w:r>
+        <w:t>Beveridgean</w:t>
+      </w:r>
+      <w:proofErr w:type="spellEnd"/>
+      <w:r>
+        <w:t xml:space="preserve"> systems (flat-rate, universal, tax-funded, dominant in Nordic countries), and Multipillar/Mixed systems (combination of public mandatory and private funded pillars). We encode this classification using two dummy variables — Bismarckian and </w:t>
+      </w:r>
+      <w:proofErr w:type="spellStart"/>
+      <w:r>
+        <w:t>Beveridgean</w:t>
+      </w:r>
+      <w:proofErr w:type="spellEnd"/>
+      <w:r>
+        <w:t xml:space="preserve"> — with Multipillar as the baseline category.</w:t>
       </w:r>
     </w:p>
     <w:p/>
@@ -1354,6 +1951,7 @@
           <w:color w:val="A6A6A6" w:themeColor="background1" w:themeShade="A6"/>
         </w:rPr>
       </w:pPr>
+      <w:proofErr w:type="spellStart"/>
       <w:r>
         <w:rPr>
           <w:b/>
@@ -1361,58 +1959,84 @@
           <w:color w:val="FF0000"/>
           <w:u w:val="single"/>
         </w:rPr>
-        <w:t>AggregateReplacementRatio:</w:t>
-      </w:r>
-      <w:r>
-        <w:rPr>
-          <w:color w:val="FF0000"/>
-        </w:rPr>
-        <w:t xml:space="preserve"> </w:t>
-      </w:r>
-    </w:p>
-    <w:p>
-      <w:r>
-        <w:t>The aggregate replacement ratio is defined as the gross median individual pension income of the population aged 65–74 relative to the gross median individual earnings of the population aged 55–64. Following Scharfstein (2018), who documents that higher public pension replacement rates are associated with more bank-based financial systems and greater household deposit holdings, and Bottazzi, Jappelli and Padula (2006), who show that pension generosity substitutes for private wealth accumulation, we use this variable as a proxy for the generosity of public pension systems across countries. Data are sourced from Eurostat (dataset tespm100) and cover EU-27 member states plus Switzerland over 2010–2025.</w:t>
-      </w:r>
-    </w:p>
-    <w:p>
-      <w:pPr>
-        <w:rPr>
-          <w:b/>
-          <w:bCs/>
-        </w:rPr>
-      </w:pPr>
-    </w:p>
-    <w:p>
-      <w:pPr>
-        <w:rPr>
-          <w:b/>
-          <w:bCs/>
-        </w:rPr>
-      </w:pPr>
-    </w:p>
-    <w:p>
-      <w:pPr>
+        <w:t>AggregateReplacementRatio</w:t>
+      </w:r>
+      <w:proofErr w:type="spellEnd"/>
+      <w:r>
         <w:rPr>
           <w:b/>
           <w:bCs/>
           <w:color w:val="FF0000"/>
           <w:u w:val="single"/>
         </w:rPr>
-      </w:pPr>
-      <w:r>
+        <w:t>:</w:t>
+      </w:r>
+      <w:r>
+        <w:rPr>
+          <w:color w:val="FF0000"/>
+        </w:rPr>
+        <w:t xml:space="preserve"> </w:t>
+      </w:r>
+    </w:p>
+    <w:p>
+      <w:r>
+        <w:t xml:space="preserve">The aggregate replacement ratio is defined as the gross median individual pension income of the population aged 65–74 relative to the gross median individual earnings of the population aged 55–64. Following Scharfstein (2018), who documents that higher public pension replacement rates are associated with more bank-based financial systems and greater household deposit holdings, and Bottazzi, </w:t>
+      </w:r>
+      <w:proofErr w:type="spellStart"/>
+      <w:r>
+        <w:t>Jappelli</w:t>
+      </w:r>
+      <w:proofErr w:type="spellEnd"/>
+      <w:r>
+        <w:t xml:space="preserve"> and Padula (2006), who show that pension generosity substitutes for private wealth accumulation, we use this variable as a proxy for the generosity of public pension systems across countries. Data are sourced from Eurostat (dataset tespm100) and cover EU-27 member states plus Switzerland over 2010–2025.</w:t>
+      </w:r>
+    </w:p>
+    <w:p>
+      <w:pPr>
+        <w:rPr>
+          <w:b/>
+          <w:bCs/>
+        </w:rPr>
+      </w:pPr>
+    </w:p>
+    <w:p>
+      <w:pPr>
+        <w:rPr>
+          <w:b/>
+          <w:bCs/>
+        </w:rPr>
+      </w:pPr>
+    </w:p>
+    <w:p>
+      <w:pPr>
         <w:rPr>
           <w:b/>
           <w:bCs/>
           <w:color w:val="FF0000"/>
           <w:u w:val="single"/>
         </w:rPr>
+      </w:pPr>
+      <w:r>
+        <w:rPr>
+          <w:b/>
+          <w:bCs/>
+          <w:color w:val="FF0000"/>
+          <w:u w:val="single"/>
+        </w:rPr>
         <w:t>Age65:</w:t>
       </w:r>
     </w:p>
     <w:p>
       <w:r>
-        <w:t>The share of the population aged 65 and above (% of total population) is sourced from the World Bank's World Development Indicators (indicator SP.POP.65UP.TO.ZS) for EU-27 member states plus Switzerland over the period 2010–2025. This variable serves as the primary measure of population aging in our analysis. Following Doerr, Kabaš and Ongena (2024) and Avramidis and Pennacchi (2025), we use the broad elderly population share as the key driver of retail deposit inflows, rather than a narrower age cutoff, as both papers demonstrate that the 65+ threshold most robustly captures the relationship between demographic aging and bank deposit funding. From a life-cycle perspective, individuals above retirement age tend to hold a disproportionately large share of their wealth in liquid deposit accounts, either as a precautionary buffer or pending bequest decisions, making this age group the primary source of retail deposit supply at the banking system level. The data require minimal cleaning — country names are matched to our EU-27 + Switzerland definition and the dataset is reshaped from wide to long format with one observation per country-year.</w:t>
+        <w:t xml:space="preserve">The share of the population aged 65 and above (% of total population) is sourced from the World Bank's World Development Indicators (indicator SP.POP.65UP.TO.ZS) for EU-27 member states plus Switzerland over the period 2010–2025. This variable serves as the primary measure of population aging in our analysis. Following Doerr, </w:t>
+      </w:r>
+      <w:proofErr w:type="spellStart"/>
+      <w:r>
+        <w:t>Kabaš</w:t>
+      </w:r>
+      <w:proofErr w:type="spellEnd"/>
+      <w:r>
+        <w:t xml:space="preserve"> and Ongena (2024) and Avramidis and Pennacchi (2025), we use the broad elderly population share as the key driver of retail deposit inflows, rather than a narrower age cutoff, as both papers demonstrate that the 65+ threshold most robustly captures the relationship between demographic aging and bank deposit funding. From a life-cycle perspective, individuals above retirement age tend to hold a disproportionately large share of their wealth in liquid deposit accounts, either as a precautionary buffer or pending bequest decisions, making this age group the primary source of retail deposit supply at the banking system level. The data require minimal cleaning — country names are matched to our EU-27 + Switzerland definition and the dataset is reshaped from wide to long format with one observation per country-year.</w:t>
       </w:r>
     </w:p>
     <w:p>
@@ -1541,14 +2165,214 @@
       <w:pPr>
         <w:spacing w:before="240" w:after="240"/>
       </w:pPr>
-      <w:r>
-        <w:rPr>
-          <w:rFonts w:ascii="Calibri" w:eastAsia="Calibri" w:hAnsi="Calibri" w:cs="Calibri"/>
-          <w:b/>
-          <w:bCs/>
-        </w:rPr>
-        <w:t>DepositRatio_ict = α + β₁·Age65_ct + β₂·FinStructure_ct + β₃·(Age65 × FinStructure)_ct + β₄·ARR_ct + β₅·DeathGap_ct + β₆·Bismarckian_c + β₇·Beveridgean_c + γ·BankControls_it + δ·MacroControls_ct + μ_i + λ_t + ε_ict</w:t>
-      </w:r>
+      <w:proofErr w:type="spellStart"/>
+      <w:r>
+        <w:rPr>
+          <w:rFonts w:ascii="Calibri" w:eastAsia="Calibri" w:hAnsi="Calibri" w:cs="Calibri"/>
+          <w:b/>
+          <w:bCs/>
+        </w:rPr>
+        <w:t>DepositRatio_ict</w:t>
+      </w:r>
+      <w:proofErr w:type="spellEnd"/>
+      <w:r>
+        <w:rPr>
+          <w:rFonts w:ascii="Calibri" w:eastAsia="Calibri" w:hAnsi="Calibri" w:cs="Calibri"/>
+          <w:b/>
+          <w:bCs/>
+        </w:rPr>
+        <w:t xml:space="preserve"> = α + β₁·Age65_ct + β₂·</w:t>
+      </w:r>
+      <w:proofErr w:type="spellStart"/>
+      <w:r>
+        <w:rPr>
+          <w:rFonts w:ascii="Calibri" w:eastAsia="Calibri" w:hAnsi="Calibri" w:cs="Calibri"/>
+          <w:b/>
+          <w:bCs/>
+        </w:rPr>
+        <w:t>FinStructure_ct</w:t>
+      </w:r>
+      <w:proofErr w:type="spellEnd"/>
+      <w:r>
+        <w:rPr>
+          <w:rFonts w:ascii="Calibri" w:eastAsia="Calibri" w:hAnsi="Calibri" w:cs="Calibri"/>
+          <w:b/>
+          <w:bCs/>
+        </w:rPr>
+        <w:t xml:space="preserve"> + β₃·(Age65 × FinStructure)_</w:t>
+      </w:r>
+      <w:proofErr w:type="spellStart"/>
+      <w:r>
+        <w:rPr>
+          <w:rFonts w:ascii="Calibri" w:eastAsia="Calibri" w:hAnsi="Calibri" w:cs="Calibri"/>
+          <w:b/>
+          <w:bCs/>
+        </w:rPr>
+        <w:t>ct</w:t>
+      </w:r>
+      <w:proofErr w:type="spellEnd"/>
+      <w:r>
+        <w:rPr>
+          <w:rFonts w:ascii="Calibri" w:eastAsia="Calibri" w:hAnsi="Calibri" w:cs="Calibri"/>
+          <w:b/>
+          <w:bCs/>
+        </w:rPr>
+        <w:t xml:space="preserve"> + β₄·</w:t>
+      </w:r>
+      <w:proofErr w:type="spellStart"/>
+      <w:r>
+        <w:rPr>
+          <w:rFonts w:ascii="Calibri" w:eastAsia="Calibri" w:hAnsi="Calibri" w:cs="Calibri"/>
+          <w:b/>
+          <w:bCs/>
+        </w:rPr>
+        <w:t>ARR_ct</w:t>
+      </w:r>
+      <w:proofErr w:type="spellEnd"/>
+      <w:r>
+        <w:rPr>
+          <w:rFonts w:ascii="Calibri" w:eastAsia="Calibri" w:hAnsi="Calibri" w:cs="Calibri"/>
+          <w:b/>
+          <w:bCs/>
+        </w:rPr>
+        <w:t xml:space="preserve"> + β₅·</w:t>
+      </w:r>
+      <w:proofErr w:type="spellStart"/>
+      <w:r>
+        <w:rPr>
+          <w:rFonts w:ascii="Calibri" w:eastAsia="Calibri" w:hAnsi="Calibri" w:cs="Calibri"/>
+          <w:b/>
+          <w:bCs/>
+        </w:rPr>
+        <w:t>DeathGap_ct</w:t>
+      </w:r>
+      <w:proofErr w:type="spellEnd"/>
+      <w:r>
+        <w:rPr>
+          <w:rFonts w:ascii="Calibri" w:eastAsia="Calibri" w:hAnsi="Calibri" w:cs="Calibri"/>
+          <w:b/>
+          <w:bCs/>
+        </w:rPr>
+        <w:t xml:space="preserve"> + β₆·</w:t>
+      </w:r>
+      <w:proofErr w:type="spellStart"/>
+      <w:r>
+        <w:rPr>
+          <w:rFonts w:ascii="Calibri" w:eastAsia="Calibri" w:hAnsi="Calibri" w:cs="Calibri"/>
+          <w:b/>
+          <w:bCs/>
+        </w:rPr>
+        <w:t>Bismarckian_c</w:t>
+      </w:r>
+      <w:proofErr w:type="spellEnd"/>
+      <w:r>
+        <w:rPr>
+          <w:rFonts w:ascii="Calibri" w:eastAsia="Calibri" w:hAnsi="Calibri" w:cs="Calibri"/>
+          <w:b/>
+          <w:bCs/>
+        </w:rPr>
+        <w:t xml:space="preserve"> + β₇·</w:t>
+      </w:r>
+      <w:proofErr w:type="spellStart"/>
+      <w:r>
+        <w:rPr>
+          <w:rFonts w:ascii="Calibri" w:eastAsia="Calibri" w:hAnsi="Calibri" w:cs="Calibri"/>
+          <w:b/>
+          <w:bCs/>
+        </w:rPr>
+        <w:t>Beveridgean_c</w:t>
+      </w:r>
+      <w:proofErr w:type="spellEnd"/>
+      <w:r>
+        <w:rPr>
+          <w:rFonts w:ascii="Calibri" w:eastAsia="Calibri" w:hAnsi="Calibri" w:cs="Calibri"/>
+          <w:b/>
+          <w:bCs/>
+        </w:rPr>
+        <w:t xml:space="preserve"> + </w:t>
+      </w:r>
+      <w:proofErr w:type="spellStart"/>
+      <w:r>
+        <w:rPr>
+          <w:rFonts w:ascii="Calibri" w:eastAsia="Calibri" w:hAnsi="Calibri" w:cs="Calibri"/>
+          <w:b/>
+          <w:bCs/>
+        </w:rPr>
+        <w:t>γ·BankControls_it</w:t>
+      </w:r>
+      <w:proofErr w:type="spellEnd"/>
+      <w:r>
+        <w:rPr>
+          <w:rFonts w:ascii="Calibri" w:eastAsia="Calibri" w:hAnsi="Calibri" w:cs="Calibri"/>
+          <w:b/>
+          <w:bCs/>
+        </w:rPr>
+        <w:t xml:space="preserve"> + </w:t>
+      </w:r>
+      <w:proofErr w:type="spellStart"/>
+      <w:r>
+        <w:rPr>
+          <w:rFonts w:ascii="Calibri" w:eastAsia="Calibri" w:hAnsi="Calibri" w:cs="Calibri"/>
+          <w:b/>
+          <w:bCs/>
+        </w:rPr>
+        <w:t>δ·MacroControls_ct</w:t>
+      </w:r>
+      <w:proofErr w:type="spellEnd"/>
+      <w:r>
+        <w:rPr>
+          <w:rFonts w:ascii="Calibri" w:eastAsia="Calibri" w:hAnsi="Calibri" w:cs="Calibri"/>
+          <w:b/>
+          <w:bCs/>
+        </w:rPr>
+        <w:t xml:space="preserve"> + </w:t>
+      </w:r>
+      <w:proofErr w:type="spellStart"/>
+      <w:r>
+        <w:rPr>
+          <w:rFonts w:ascii="Calibri" w:eastAsia="Calibri" w:hAnsi="Calibri" w:cs="Calibri"/>
+          <w:b/>
+          <w:bCs/>
+        </w:rPr>
+        <w:t>μ_i</w:t>
+      </w:r>
+      <w:proofErr w:type="spellEnd"/>
+      <w:r>
+        <w:rPr>
+          <w:rFonts w:ascii="Calibri" w:eastAsia="Calibri" w:hAnsi="Calibri" w:cs="Calibri"/>
+          <w:b/>
+          <w:bCs/>
+        </w:rPr>
+        <w:t xml:space="preserve"> + </w:t>
+      </w:r>
+      <w:proofErr w:type="spellStart"/>
+      <w:r>
+        <w:rPr>
+          <w:rFonts w:ascii="Calibri" w:eastAsia="Calibri" w:hAnsi="Calibri" w:cs="Calibri"/>
+          <w:b/>
+          <w:bCs/>
+        </w:rPr>
+        <w:t>λ_t</w:t>
+      </w:r>
+      <w:proofErr w:type="spellEnd"/>
+      <w:r>
+        <w:rPr>
+          <w:rFonts w:ascii="Calibri" w:eastAsia="Calibri" w:hAnsi="Calibri" w:cs="Calibri"/>
+          <w:b/>
+          <w:bCs/>
+        </w:rPr>
+        <w:t xml:space="preserve"> + </w:t>
+      </w:r>
+      <w:proofErr w:type="spellStart"/>
+      <w:r>
+        <w:rPr>
+          <w:rFonts w:ascii="Calibri" w:eastAsia="Calibri" w:hAnsi="Calibri" w:cs="Calibri"/>
+          <w:b/>
+          <w:bCs/>
+        </w:rPr>
+        <w:t>ε_ict</w:t>
+      </w:r>
+      <w:proofErr w:type="spellEnd"/>
     </w:p>
     <w:p>
       <w:pPr>
@@ -1668,7 +2492,49 @@
         <w:rPr>
           <w:rFonts w:ascii="Calibri" w:eastAsia="Calibri" w:hAnsi="Calibri" w:cs="Calibri"/>
         </w:rPr>
-        <w:t xml:space="preserve"> Add β₄ (ARR), β₅ (DeathGap), β₆ and β₇ (pension system dummies). Note that Bismarckian and Beveridgean are dummies with Multipillar as baseline, exactly as your PPT specifies. ARR and DeathGap are time-varying; the pension dummies are time-invariant at country level — this matters when you add fixed effects in Model 5.</w:t>
+        <w:t xml:space="preserve"> Add β₄ (ARR), β₅ (</w:t>
+      </w:r>
+      <w:proofErr w:type="spellStart"/>
+      <w:r>
+        <w:rPr>
+          <w:rFonts w:ascii="Calibri" w:eastAsia="Calibri" w:hAnsi="Calibri" w:cs="Calibri"/>
+        </w:rPr>
+        <w:t>DeathGap</w:t>
+      </w:r>
+      <w:proofErr w:type="spellEnd"/>
+      <w:r>
+        <w:rPr>
+          <w:rFonts w:ascii="Calibri" w:eastAsia="Calibri" w:hAnsi="Calibri" w:cs="Calibri"/>
+        </w:rPr>
+        <w:t xml:space="preserve">), β₆ and β₇ (pension system dummies). Note that Bismarckian and </w:t>
+      </w:r>
+      <w:proofErr w:type="spellStart"/>
+      <w:r>
+        <w:rPr>
+          <w:rFonts w:ascii="Calibri" w:eastAsia="Calibri" w:hAnsi="Calibri" w:cs="Calibri"/>
+        </w:rPr>
+        <w:t>Beveridgean</w:t>
+      </w:r>
+      <w:proofErr w:type="spellEnd"/>
+      <w:r>
+        <w:rPr>
+          <w:rFonts w:ascii="Calibri" w:eastAsia="Calibri" w:hAnsi="Calibri" w:cs="Calibri"/>
+        </w:rPr>
+        <w:t xml:space="preserve"> are dummies with Multipillar as baseline, exactly as your PPT specifies. ARR and </w:t>
+      </w:r>
+      <w:proofErr w:type="spellStart"/>
+      <w:r>
+        <w:rPr>
+          <w:rFonts w:ascii="Calibri" w:eastAsia="Calibri" w:hAnsi="Calibri" w:cs="Calibri"/>
+        </w:rPr>
+        <w:t>DeathGap</w:t>
+      </w:r>
+      <w:proofErr w:type="spellEnd"/>
+      <w:r>
+        <w:rPr>
+          <w:rFonts w:ascii="Calibri" w:eastAsia="Calibri" w:hAnsi="Calibri" w:cs="Calibri"/>
+        </w:rPr>
+        <w:t xml:space="preserve"> are time-varying; the pension dummies are time-invariant at country level — this matters when you add fixed effects in Model 5.</w:t>
       </w:r>
     </w:p>
     <w:p>
@@ -1706,7 +2572,35 @@
         <w:rPr>
           <w:rFonts w:ascii="Calibri" w:eastAsia="Calibri" w:hAnsi="Calibri" w:cs="Calibri"/>
         </w:rPr>
-        <w:t xml:space="preserve"> Add bank fixed effects μ_i and year fixed effects λ_t. This is your preferred specification. Present it as such explicitly.</w:t>
+        <w:t xml:space="preserve"> Add bank fixed effects </w:t>
+      </w:r>
+      <w:proofErr w:type="spellStart"/>
+      <w:r>
+        <w:rPr>
+          <w:rFonts w:ascii="Calibri" w:eastAsia="Calibri" w:hAnsi="Calibri" w:cs="Calibri"/>
+        </w:rPr>
+        <w:t>μ_i</w:t>
+      </w:r>
+      <w:proofErr w:type="spellEnd"/>
+      <w:r>
+        <w:rPr>
+          <w:rFonts w:ascii="Calibri" w:eastAsia="Calibri" w:hAnsi="Calibri" w:cs="Calibri"/>
+        </w:rPr>
+        <w:t xml:space="preserve"> and year fixed effects </w:t>
+      </w:r>
+      <w:proofErr w:type="spellStart"/>
+      <w:r>
+        <w:rPr>
+          <w:rFonts w:ascii="Calibri" w:eastAsia="Calibri" w:hAnsi="Calibri" w:cs="Calibri"/>
+        </w:rPr>
+        <w:t>λ_t</w:t>
+      </w:r>
+      <w:proofErr w:type="spellEnd"/>
+      <w:r>
+        <w:rPr>
+          <w:rFonts w:ascii="Calibri" w:eastAsia="Calibri" w:hAnsi="Calibri" w:cs="Calibri"/>
+        </w:rPr>
+        <w:t>. This is your preferred specification. Present it as such explicitly.</w:t>
       </w:r>
     </w:p>
     <w:p/>
@@ -1745,7 +2639,25 @@
           <w:b/>
           <w:bCs/>
         </w:rPr>
-        <w:t>Bank FE (μ_i)</w:t>
+        <w:t>Bank FE (</w:t>
+      </w:r>
+      <w:proofErr w:type="spellStart"/>
+      <w:r>
+        <w:rPr>
+          <w:rFonts w:ascii="Calibri" w:eastAsia="Calibri" w:hAnsi="Calibri" w:cs="Calibri"/>
+          <w:b/>
+          <w:bCs/>
+        </w:rPr>
+        <w:t>μ_i</w:t>
+      </w:r>
+      <w:proofErr w:type="spellEnd"/>
+      <w:r>
+        <w:rPr>
+          <w:rFonts w:ascii="Calibri" w:eastAsia="Calibri" w:hAnsi="Calibri" w:cs="Calibri"/>
+          <w:b/>
+          <w:bCs/>
+        </w:rPr>
+        <w:t>)</w:t>
       </w:r>
       <w:r>
         <w:rPr>
@@ -1764,7 +2676,25 @@
           <w:b/>
           <w:bCs/>
         </w:rPr>
-        <w:t>Year FE (λ_t)</w:t>
+        <w:t>Year FE (</w:t>
+      </w:r>
+      <w:proofErr w:type="spellStart"/>
+      <w:r>
+        <w:rPr>
+          <w:rFonts w:ascii="Calibri" w:eastAsia="Calibri" w:hAnsi="Calibri" w:cs="Calibri"/>
+          <w:b/>
+          <w:bCs/>
+        </w:rPr>
+        <w:t>λ_t</w:t>
+      </w:r>
+      <w:proofErr w:type="spellEnd"/>
+      <w:r>
+        <w:rPr>
+          <w:rFonts w:ascii="Calibri" w:eastAsia="Calibri" w:hAnsi="Calibri" w:cs="Calibri"/>
+          <w:b/>
+          <w:bCs/>
+        </w:rPr>
+        <w:t>)</w:t>
       </w:r>
       <w:r>
         <w:rPr>
@@ -1783,7 +2713,25 @@
           <w:b/>
           <w:bCs/>
         </w:rPr>
-        <w:t>The pension system dummies (Bismarckian, Beveridgean)</w:t>
+        <w:t xml:space="preserve">The pension system dummies (Bismarckian, </w:t>
+      </w:r>
+      <w:proofErr w:type="spellStart"/>
+      <w:r>
+        <w:rPr>
+          <w:rFonts w:ascii="Calibri" w:eastAsia="Calibri" w:hAnsi="Calibri" w:cs="Calibri"/>
+          <w:b/>
+          <w:bCs/>
+        </w:rPr>
+        <w:t>Beveridgean</w:t>
+      </w:r>
+      <w:proofErr w:type="spellEnd"/>
+      <w:r>
+        <w:rPr>
+          <w:rFonts w:ascii="Calibri" w:eastAsia="Calibri" w:hAnsi="Calibri" w:cs="Calibri"/>
+          <w:b/>
+          <w:bCs/>
+        </w:rPr>
+        <w:t>)</w:t>
       </w:r>
       <w:r>
         <w:rPr>
@@ -1816,8 +2764,18 @@
           <w:b/>
           <w:bCs/>
         </w:rPr>
-        <w:t>ARR and DeathGap</w:t>
-      </w:r>
+        <w:t xml:space="preserve">ARR and </w:t>
+      </w:r>
+      <w:proofErr w:type="spellStart"/>
+      <w:r>
+        <w:rPr>
+          <w:rFonts w:ascii="Calibri" w:eastAsia="Calibri" w:hAnsi="Calibri" w:cs="Calibri"/>
+          <w:b/>
+          <w:bCs/>
+        </w:rPr>
+        <w:t>DeathGap</w:t>
+      </w:r>
+      <w:proofErr w:type="spellEnd"/>
       <w:r>
         <w:rPr>
           <w:rFonts w:ascii="Calibri" w:eastAsia="Calibri" w:hAnsi="Calibri" w:cs="Calibri"/>
@@ -2018,7 +2976,21 @@
         <w:rPr>
           <w:rFonts w:ascii="Calibri" w:eastAsia="Calibri" w:hAnsi="Calibri" w:cs="Calibri"/>
         </w:rPr>
-        <w:t xml:space="preserve"> ECB Statistical Data Warehouse for eurozone countries; for non-euro countries (Denmark, Sweden, Poland, Czech Republic, Hungary, Romania, Bulgaria, Croatia, Switzerland) use national central bank rates or the OECD MEI database. Alternatively, Eurostat table irt_st_a gives harmonized short-term rates. Interest rates matter because low/negative rates post-2015 compressed deposit margins and may have structurally changed deposit behavior. Year FE will absorb the </w:t>
+        <w:t xml:space="preserve"> ECB Statistical Data Warehouse for eurozone countries; for non-euro countries (Denmark, Sweden, Poland, Czech Republic, Hungary, Romania, Bulgaria, Croatia, Switzerland) use national central bank rates or the OECD MEI database. Alternatively, Eurostat table </w:t>
+      </w:r>
+      <w:proofErr w:type="spellStart"/>
+      <w:r>
+        <w:rPr>
+          <w:rFonts w:ascii="Calibri" w:eastAsia="Calibri" w:hAnsi="Calibri" w:cs="Calibri"/>
+        </w:rPr>
+        <w:t>irt_st_a</w:t>
+      </w:r>
+      <w:proofErr w:type="spellEnd"/>
+      <w:r>
+        <w:rPr>
+          <w:rFonts w:ascii="Calibri" w:eastAsia="Calibri" w:hAnsi="Calibri" w:cs="Calibri"/>
+        </w:rPr>
+        <w:t xml:space="preserve"> gives harmonized short-term rates. Interest rates matter because low/negative rates post-2015 compressed deposit margins and may have structurally changed deposit behavior. Year FE will absorb the </w:t>
       </w:r>
       <w:r>
         <w:rPr>
@@ -2099,7 +3071,21 @@
         <w:rPr>
           <w:rFonts w:ascii="Calibri" w:eastAsia="Calibri" w:hAnsi="Calibri" w:cs="Calibri"/>
         </w:rPr>
-        <w:t xml:space="preserve"> In R with fixest (which is what you should use — it's the fastest and most flexible package for this):</w:t>
+        <w:t xml:space="preserve"> In R with </w:t>
+      </w:r>
+      <w:proofErr w:type="spellStart"/>
+      <w:r>
+        <w:rPr>
+          <w:rFonts w:ascii="Calibri" w:eastAsia="Calibri" w:hAnsi="Calibri" w:cs="Calibri"/>
+        </w:rPr>
+        <w:t>fixest</w:t>
+      </w:r>
+      <w:proofErr w:type="spellEnd"/>
+      <w:r>
+        <w:rPr>
+          <w:rFonts w:ascii="Calibri" w:eastAsia="Calibri" w:hAnsi="Calibri" w:cs="Calibri"/>
+        </w:rPr>
+        <w:t xml:space="preserve"> (which is what you should use — it's the fastest and most flexible package for this):</w:t>
       </w:r>
     </w:p>
     <w:p>
@@ -2125,6 +3111,7 @@
         </w:rPr>
         <w:t>(</w:t>
       </w:r>
+      <w:proofErr w:type="spellStart"/>
       <w:r>
         <w:rPr>
           <w:rFonts w:ascii="Calibri" w:eastAsia="Calibri" w:hAnsi="Calibri" w:cs="Calibri"/>
@@ -2132,6 +3119,7 @@
         </w:rPr>
         <w:t>fixest</w:t>
       </w:r>
+      <w:proofErr w:type="spellEnd"/>
       <w:r>
         <w:rPr>
           <w:rFonts w:ascii="Calibri" w:eastAsia="Calibri" w:hAnsi="Calibri" w:cs="Calibri"/>
@@ -2150,8 +3138,17 @@
           <w:rFonts w:ascii="Calibri" w:eastAsia="Calibri" w:hAnsi="Calibri" w:cs="Calibri"/>
           <w:color w:val="14181F"/>
         </w:rPr>
-        <w:t>model5 &lt;- feols</w:t>
-      </w:r>
+        <w:t xml:space="preserve">model5 &lt;- </w:t>
+      </w:r>
+      <w:proofErr w:type="spellStart"/>
+      <w:r>
+        <w:rPr>
+          <w:rFonts w:ascii="Calibri" w:eastAsia="Calibri" w:hAnsi="Calibri" w:cs="Calibri"/>
+          <w:color w:val="14181F"/>
+        </w:rPr>
+        <w:t>feols</w:t>
+      </w:r>
+      <w:proofErr w:type="spellEnd"/>
       <w:r>
         <w:rPr>
           <w:rFonts w:ascii="Calibri" w:eastAsia="Calibri" w:hAnsi="Calibri" w:cs="Calibri"/>
@@ -2167,7 +3164,39 @@
           <w:rFonts w:ascii="Calibri" w:eastAsia="Calibri" w:hAnsi="Calibri" w:cs="Calibri"/>
           <w:color w:val="14181F"/>
         </w:rPr>
-        <w:t xml:space="preserve">  Deposit_Ratio ~ Age65_pct * FinStructure + agg_replacement_ratio + </w:t>
+        <w:t xml:space="preserve">  </w:t>
+      </w:r>
+      <w:proofErr w:type="spellStart"/>
+      <w:r>
+        <w:rPr>
+          <w:rFonts w:ascii="Calibri" w:eastAsia="Calibri" w:hAnsi="Calibri" w:cs="Calibri"/>
+          <w:color w:val="14181F"/>
+        </w:rPr>
+        <w:t>Deposit_Ratio</w:t>
+      </w:r>
+      <w:proofErr w:type="spellEnd"/>
+      <w:r>
+        <w:rPr>
+          <w:rFonts w:ascii="Calibri" w:eastAsia="Calibri" w:hAnsi="Calibri" w:cs="Calibri"/>
+          <w:color w:val="14181F"/>
+        </w:rPr>
+        <w:t xml:space="preserve"> ~ Age65_pct * FinStructure + </w:t>
+      </w:r>
+      <w:proofErr w:type="spellStart"/>
+      <w:r>
+        <w:rPr>
+          <w:rFonts w:ascii="Calibri" w:eastAsia="Calibri" w:hAnsi="Calibri" w:cs="Calibri"/>
+          <w:color w:val="14181F"/>
+        </w:rPr>
+        <w:t>agg_replacement_ratio</w:t>
+      </w:r>
+      <w:proofErr w:type="spellEnd"/>
+      <w:r>
+        <w:rPr>
+          <w:rFonts w:ascii="Calibri" w:eastAsia="Calibri" w:hAnsi="Calibri" w:cs="Calibri"/>
+          <w:color w:val="14181F"/>
+        </w:rPr>
+        <w:t xml:space="preserve"> + </w:t>
       </w:r>
       <w:r>
         <w:br/>
@@ -2177,7 +3206,23 @@
           <w:rFonts w:ascii="Calibri" w:eastAsia="Calibri" w:hAnsi="Calibri" w:cs="Calibri"/>
           <w:color w:val="14181F"/>
         </w:rPr>
-        <w:t xml:space="preserve">    DeathGap + log</w:t>
+        <w:t xml:space="preserve">    </w:t>
+      </w:r>
+      <w:proofErr w:type="spellStart"/>
+      <w:r>
+        <w:rPr>
+          <w:rFonts w:ascii="Calibri" w:eastAsia="Calibri" w:hAnsi="Calibri" w:cs="Calibri"/>
+          <w:color w:val="14181F"/>
+        </w:rPr>
+        <w:t>DeathGap</w:t>
+      </w:r>
+      <w:proofErr w:type="spellEnd"/>
+      <w:r>
+        <w:rPr>
+          <w:rFonts w:ascii="Calibri" w:eastAsia="Calibri" w:hAnsi="Calibri" w:cs="Calibri"/>
+          <w:color w:val="14181F"/>
+        </w:rPr>
+        <w:t xml:space="preserve"> + log</w:t>
       </w:r>
       <w:r>
         <w:rPr>
@@ -2186,6 +3231,7 @@
         </w:rPr>
         <w:t>(</w:t>
       </w:r>
+      <w:proofErr w:type="spellStart"/>
       <w:r>
         <w:rPr>
           <w:rFonts w:ascii="Calibri" w:eastAsia="Calibri" w:hAnsi="Calibri" w:cs="Calibri"/>
@@ -2193,6 +3239,7 @@
         </w:rPr>
         <w:t>Total_Assets</w:t>
       </w:r>
+      <w:proofErr w:type="spellEnd"/>
       <w:r>
         <w:rPr>
           <w:rFonts w:ascii="Calibri" w:eastAsia="Calibri" w:hAnsi="Calibri" w:cs="Calibri"/>
@@ -2205,7 +3252,39 @@
           <w:rFonts w:ascii="Calibri" w:eastAsia="Calibri" w:hAnsi="Calibri" w:cs="Calibri"/>
           <w:color w:val="14181F"/>
         </w:rPr>
-        <w:t xml:space="preserve"> + Loan_Ratio + Equity_Ratio + ROA +</w:t>
+        <w:t xml:space="preserve"> + </w:t>
+      </w:r>
+      <w:proofErr w:type="spellStart"/>
+      <w:r>
+        <w:rPr>
+          <w:rFonts w:ascii="Calibri" w:eastAsia="Calibri" w:hAnsi="Calibri" w:cs="Calibri"/>
+          <w:color w:val="14181F"/>
+        </w:rPr>
+        <w:t>Loan_Ratio</w:t>
+      </w:r>
+      <w:proofErr w:type="spellEnd"/>
+      <w:r>
+        <w:rPr>
+          <w:rFonts w:ascii="Calibri" w:eastAsia="Calibri" w:hAnsi="Calibri" w:cs="Calibri"/>
+          <w:color w:val="14181F"/>
+        </w:rPr>
+        <w:t xml:space="preserve"> + </w:t>
+      </w:r>
+      <w:proofErr w:type="spellStart"/>
+      <w:r>
+        <w:rPr>
+          <w:rFonts w:ascii="Calibri" w:eastAsia="Calibri" w:hAnsi="Calibri" w:cs="Calibri"/>
+          <w:color w:val="14181F"/>
+        </w:rPr>
+        <w:t>Equity_Ratio</w:t>
+      </w:r>
+      <w:proofErr w:type="spellEnd"/>
+      <w:r>
+        <w:rPr>
+          <w:rFonts w:ascii="Calibri" w:eastAsia="Calibri" w:hAnsi="Calibri" w:cs="Calibri"/>
+          <w:color w:val="14181F"/>
+        </w:rPr>
+        <w:t xml:space="preserve"> + ROA +</w:t>
       </w:r>
       <w:r>
         <w:br/>
@@ -2215,8 +3294,49 @@
           <w:rFonts w:ascii="Calibri" w:eastAsia="Calibri" w:hAnsi="Calibri" w:cs="Calibri"/>
           <w:color w:val="14181F"/>
         </w:rPr>
-        <w:t xml:space="preserve">    GDP_growth + interest_rate | Entity.ID + fiscal_year</w:t>
-      </w:r>
+        <w:t xml:space="preserve">    </w:t>
+      </w:r>
+      <w:proofErr w:type="spellStart"/>
+      <w:r>
+        <w:rPr>
+          <w:rFonts w:ascii="Calibri" w:eastAsia="Calibri" w:hAnsi="Calibri" w:cs="Calibri"/>
+          <w:color w:val="14181F"/>
+        </w:rPr>
+        <w:t>GDP_growth</w:t>
+      </w:r>
+      <w:proofErr w:type="spellEnd"/>
+      <w:r>
+        <w:rPr>
+          <w:rFonts w:ascii="Calibri" w:eastAsia="Calibri" w:hAnsi="Calibri" w:cs="Calibri"/>
+          <w:color w:val="14181F"/>
+        </w:rPr>
+        <w:t xml:space="preserve"> + </w:t>
+      </w:r>
+      <w:proofErr w:type="spellStart"/>
+      <w:r>
+        <w:rPr>
+          <w:rFonts w:ascii="Calibri" w:eastAsia="Calibri" w:hAnsi="Calibri" w:cs="Calibri"/>
+          <w:color w:val="14181F"/>
+        </w:rPr>
+        <w:t>interest_rate</w:t>
+      </w:r>
+      <w:proofErr w:type="spellEnd"/>
+      <w:r>
+        <w:rPr>
+          <w:rFonts w:ascii="Calibri" w:eastAsia="Calibri" w:hAnsi="Calibri" w:cs="Calibri"/>
+          <w:color w:val="14181F"/>
+        </w:rPr>
+        <w:t xml:space="preserve"> | Entity.ID + </w:t>
+      </w:r>
+      <w:proofErr w:type="spellStart"/>
+      <w:r>
+        <w:rPr>
+          <w:rFonts w:ascii="Calibri" w:eastAsia="Calibri" w:hAnsi="Calibri" w:cs="Calibri"/>
+          <w:color w:val="14181F"/>
+        </w:rPr>
+        <w:t>fiscal_year</w:t>
+      </w:r>
+      <w:proofErr w:type="spellEnd"/>
       <w:r>
         <w:rPr>
           <w:rFonts w:ascii="Calibri" w:eastAsia="Calibri" w:hAnsi="Calibri" w:cs="Calibri"/>
@@ -2232,8 +3352,17 @@
           <w:rFonts w:ascii="Calibri" w:eastAsia="Calibri" w:hAnsi="Calibri" w:cs="Calibri"/>
           <w:color w:val="14181F"/>
         </w:rPr>
-        <w:t xml:space="preserve">  data = your_data</w:t>
-      </w:r>
+        <w:t xml:space="preserve">  data = </w:t>
+      </w:r>
+      <w:proofErr w:type="spellStart"/>
+      <w:r>
+        <w:rPr>
+          <w:rFonts w:ascii="Calibri" w:eastAsia="Calibri" w:hAnsi="Calibri" w:cs="Calibri"/>
+          <w:color w:val="14181F"/>
+        </w:rPr>
+        <w:t>your_data</w:t>
+      </w:r>
+      <w:proofErr w:type="spellEnd"/>
       <w:r>
         <w:rPr>
           <w:rFonts w:ascii="Calibri" w:eastAsia="Calibri" w:hAnsi="Calibri" w:cs="Calibri"/>
@@ -2306,7 +3435,49 @@
         <w:rPr>
           <w:rFonts w:ascii="Calibri" w:eastAsia="Calibri" w:hAnsi="Calibri" w:cs="Calibri"/>
         </w:rPr>
-        <w:t xml:space="preserve"> (Cameron, Gelbach &amp; Miller 2008), available in R via the wildboottest package or directly in fixest via boot_se. For a master's paper, raise this with your professor — she may say clustered SEs are sufficient at this level, which is a reasonable position. But knowing the argument shows methodological maturity.</w:t>
+        <w:t xml:space="preserve"> (Cameron, Gelbach &amp; Miller 2008), available in R via the </w:t>
+      </w:r>
+      <w:proofErr w:type="spellStart"/>
+      <w:r>
+        <w:rPr>
+          <w:rFonts w:ascii="Calibri" w:eastAsia="Calibri" w:hAnsi="Calibri" w:cs="Calibri"/>
+        </w:rPr>
+        <w:t>wildboottest</w:t>
+      </w:r>
+      <w:proofErr w:type="spellEnd"/>
+      <w:r>
+        <w:rPr>
+          <w:rFonts w:ascii="Calibri" w:eastAsia="Calibri" w:hAnsi="Calibri" w:cs="Calibri"/>
+        </w:rPr>
+        <w:t xml:space="preserve"> package or directly in </w:t>
+      </w:r>
+      <w:proofErr w:type="spellStart"/>
+      <w:r>
+        <w:rPr>
+          <w:rFonts w:ascii="Calibri" w:eastAsia="Calibri" w:hAnsi="Calibri" w:cs="Calibri"/>
+        </w:rPr>
+        <w:t>fixest</w:t>
+      </w:r>
+      <w:proofErr w:type="spellEnd"/>
+      <w:r>
+        <w:rPr>
+          <w:rFonts w:ascii="Calibri" w:eastAsia="Calibri" w:hAnsi="Calibri" w:cs="Calibri"/>
+        </w:rPr>
+        <w:t xml:space="preserve"> via </w:t>
+      </w:r>
+      <w:proofErr w:type="spellStart"/>
+      <w:r>
+        <w:rPr>
+          <w:rFonts w:ascii="Calibri" w:eastAsia="Calibri" w:hAnsi="Calibri" w:cs="Calibri"/>
+        </w:rPr>
+        <w:t>boot_se</w:t>
+      </w:r>
+      <w:proofErr w:type="spellEnd"/>
+      <w:r>
+        <w:rPr>
+          <w:rFonts w:ascii="Calibri" w:eastAsia="Calibri" w:hAnsi="Calibri" w:cs="Calibri"/>
+        </w:rPr>
+        <w:t>. For a master's paper, raise this with your professor — she may say clustered SEs are sufficient at this level, which is a reasonable position. But knowing the argument shows methodological maturity.</w:t>
       </w:r>
     </w:p>
     <w:p/>
@@ -2371,6 +3542,7 @@
         </w:rPr>
         <w:t>(</w:t>
       </w:r>
+      <w:proofErr w:type="spellStart"/>
       <w:r>
         <w:rPr>
           <w:rFonts w:ascii="Calibri" w:eastAsia="Calibri" w:hAnsi="Calibri" w:cs="Calibri"/>
@@ -2378,6 +3550,7 @@
         </w:rPr>
         <w:t>plm</w:t>
       </w:r>
+      <w:proofErr w:type="spellEnd"/>
       <w:r>
         <w:rPr>
           <w:rFonts w:ascii="Calibri" w:eastAsia="Calibri" w:hAnsi="Calibri" w:cs="Calibri"/>
@@ -2388,13 +3561,31 @@
       <w:r>
         <w:br/>
       </w:r>
+      <w:proofErr w:type="spellStart"/>
       <w:r>
         <w:rPr>
           <w:rFonts w:ascii="Calibri" w:eastAsia="Calibri" w:hAnsi="Calibri" w:cs="Calibri"/>
           <w:color w:val="14181F"/>
         </w:rPr>
-        <w:t>fe_model &lt;- plm</w:t>
-      </w:r>
+        <w:t>fe_model</w:t>
+      </w:r>
+      <w:proofErr w:type="spellEnd"/>
+      <w:r>
+        <w:rPr>
+          <w:rFonts w:ascii="Calibri" w:eastAsia="Calibri" w:hAnsi="Calibri" w:cs="Calibri"/>
+          <w:color w:val="14181F"/>
+        </w:rPr>
+        <w:t xml:space="preserve"> &lt;- </w:t>
+      </w:r>
+      <w:proofErr w:type="spellStart"/>
+      <w:r>
+        <w:rPr>
+          <w:rFonts w:ascii="Calibri" w:eastAsia="Calibri" w:hAnsi="Calibri" w:cs="Calibri"/>
+          <w:color w:val="14181F"/>
+        </w:rPr>
+        <w:t>plm</w:t>
+      </w:r>
+      <w:proofErr w:type="spellEnd"/>
       <w:r>
         <w:rPr>
           <w:rFonts w:ascii="Calibri" w:eastAsia="Calibri" w:hAnsi="Calibri" w:cs="Calibri"/>
@@ -2402,12 +3593,21 @@
         </w:rPr>
         <w:t>(</w:t>
       </w:r>
+      <w:proofErr w:type="spellStart"/>
       <w:r>
         <w:rPr>
           <w:rFonts w:ascii="Calibri" w:eastAsia="Calibri" w:hAnsi="Calibri" w:cs="Calibri"/>
           <w:color w:val="14181F"/>
         </w:rPr>
-        <w:t>Deposit_Ratio ~ Age65_pct + FinStructure</w:t>
+        <w:t>Deposit_Ratio</w:t>
+      </w:r>
+      <w:proofErr w:type="spellEnd"/>
+      <w:r>
+        <w:rPr>
+          <w:rFonts w:ascii="Calibri" w:eastAsia="Calibri" w:hAnsi="Calibri" w:cs="Calibri"/>
+          <w:color w:val="14181F"/>
+        </w:rPr>
+        <w:t xml:space="preserve"> ~ Age65_pct + FinStructure</w:t>
       </w:r>
       <w:r>
         <w:rPr>
@@ -2431,8 +3631,17 @@
           <w:rFonts w:ascii="Calibri" w:eastAsia="Calibri" w:hAnsi="Calibri" w:cs="Calibri"/>
           <w:color w:val="14181F"/>
         </w:rPr>
-        <w:t xml:space="preserve">                data = your_data</w:t>
-      </w:r>
+        <w:t xml:space="preserve">                data = </w:t>
+      </w:r>
+      <w:proofErr w:type="spellStart"/>
+      <w:r>
+        <w:rPr>
+          <w:rFonts w:ascii="Calibri" w:eastAsia="Calibri" w:hAnsi="Calibri" w:cs="Calibri"/>
+          <w:color w:val="14181F"/>
+        </w:rPr>
+        <w:t>your_data</w:t>
+      </w:r>
+      <w:proofErr w:type="spellEnd"/>
       <w:r>
         <w:rPr>
           <w:rFonts w:ascii="Calibri" w:eastAsia="Calibri" w:hAnsi="Calibri" w:cs="Calibri"/>
@@ -2473,7 +3682,23 @@
           <w:rFonts w:ascii="Calibri" w:eastAsia="Calibri" w:hAnsi="Calibri" w:cs="Calibri"/>
           <w:color w:val="008000"/>
         </w:rPr>
-        <w:t>"fiscal_year"</w:t>
+        <w:t>"</w:t>
+      </w:r>
+      <w:proofErr w:type="spellStart"/>
+      <w:r>
+        <w:rPr>
+          <w:rFonts w:ascii="Calibri" w:eastAsia="Calibri" w:hAnsi="Calibri" w:cs="Calibri"/>
+          <w:color w:val="008000"/>
+        </w:rPr>
+        <w:t>fiscal_year</w:t>
+      </w:r>
+      <w:proofErr w:type="spellEnd"/>
+      <w:r>
+        <w:rPr>
+          <w:rFonts w:ascii="Calibri" w:eastAsia="Calibri" w:hAnsi="Calibri" w:cs="Calibri"/>
+          <w:color w:val="008000"/>
+        </w:rPr>
+        <w:t>"</w:t>
       </w:r>
       <w:r>
         <w:rPr>
@@ -2516,13 +3741,31 @@
       <w:r>
         <w:br/>
       </w:r>
+      <w:proofErr w:type="spellStart"/>
       <w:r>
         <w:rPr>
           <w:rFonts w:ascii="Calibri" w:eastAsia="Calibri" w:hAnsi="Calibri" w:cs="Calibri"/>
           <w:color w:val="14181F"/>
         </w:rPr>
-        <w:t>re_model &lt;- plm</w:t>
-      </w:r>
+        <w:t>re_model</w:t>
+      </w:r>
+      <w:proofErr w:type="spellEnd"/>
+      <w:r>
+        <w:rPr>
+          <w:rFonts w:ascii="Calibri" w:eastAsia="Calibri" w:hAnsi="Calibri" w:cs="Calibri"/>
+          <w:color w:val="14181F"/>
+        </w:rPr>
+        <w:t xml:space="preserve"> &lt;- </w:t>
+      </w:r>
+      <w:proofErr w:type="spellStart"/>
+      <w:r>
+        <w:rPr>
+          <w:rFonts w:ascii="Calibri" w:eastAsia="Calibri" w:hAnsi="Calibri" w:cs="Calibri"/>
+          <w:color w:val="14181F"/>
+        </w:rPr>
+        <w:t>plm</w:t>
+      </w:r>
+      <w:proofErr w:type="spellEnd"/>
       <w:r>
         <w:rPr>
           <w:rFonts w:ascii="Calibri" w:eastAsia="Calibri" w:hAnsi="Calibri" w:cs="Calibri"/>
@@ -2530,12 +3773,21 @@
         </w:rPr>
         <w:t>(</w:t>
       </w:r>
+      <w:proofErr w:type="spellStart"/>
       <w:r>
         <w:rPr>
           <w:rFonts w:ascii="Calibri" w:eastAsia="Calibri" w:hAnsi="Calibri" w:cs="Calibri"/>
           <w:color w:val="14181F"/>
         </w:rPr>
-        <w:t>Deposit_Ratio ~ Age65_pct + FinStructure</w:t>
+        <w:t>Deposit_Ratio</w:t>
+      </w:r>
+      <w:proofErr w:type="spellEnd"/>
+      <w:r>
+        <w:rPr>
+          <w:rFonts w:ascii="Calibri" w:eastAsia="Calibri" w:hAnsi="Calibri" w:cs="Calibri"/>
+          <w:color w:val="14181F"/>
+        </w:rPr>
+        <w:t xml:space="preserve"> ~ Age65_pct + FinStructure</w:t>
       </w:r>
       <w:r>
         <w:rPr>
@@ -2552,8 +3804,17 @@
           <w:rFonts w:ascii="Calibri" w:eastAsia="Calibri" w:hAnsi="Calibri" w:cs="Calibri"/>
           <w:color w:val="14181F"/>
         </w:rPr>
-        <w:t xml:space="preserve">                data = your_data</w:t>
-      </w:r>
+        <w:t xml:space="preserve">                data = </w:t>
+      </w:r>
+      <w:proofErr w:type="spellStart"/>
+      <w:r>
+        <w:rPr>
+          <w:rFonts w:ascii="Calibri" w:eastAsia="Calibri" w:hAnsi="Calibri" w:cs="Calibri"/>
+          <w:color w:val="14181F"/>
+        </w:rPr>
+        <w:t>your_data</w:t>
+      </w:r>
+      <w:proofErr w:type="spellEnd"/>
       <w:r>
         <w:rPr>
           <w:rFonts w:ascii="Calibri" w:eastAsia="Calibri" w:hAnsi="Calibri" w:cs="Calibri"/>
@@ -2594,7 +3855,23 @@
           <w:rFonts w:ascii="Calibri" w:eastAsia="Calibri" w:hAnsi="Calibri" w:cs="Calibri"/>
           <w:color w:val="008000"/>
         </w:rPr>
-        <w:t>"fiscal_year"</w:t>
+        <w:t>"</w:t>
+      </w:r>
+      <w:proofErr w:type="spellStart"/>
+      <w:r>
+        <w:rPr>
+          <w:rFonts w:ascii="Calibri" w:eastAsia="Calibri" w:hAnsi="Calibri" w:cs="Calibri"/>
+          <w:color w:val="008000"/>
+        </w:rPr>
+        <w:t>fiscal_year</w:t>
+      </w:r>
+      <w:proofErr w:type="spellEnd"/>
+      <w:r>
+        <w:rPr>
+          <w:rFonts w:ascii="Calibri" w:eastAsia="Calibri" w:hAnsi="Calibri" w:cs="Calibri"/>
+          <w:color w:val="008000"/>
+        </w:rPr>
+        <w:t>"</w:t>
       </w:r>
       <w:r>
         <w:rPr>
@@ -2630,6 +3907,7 @@
       <w:r>
         <w:br/>
       </w:r>
+      <w:proofErr w:type="spellStart"/>
       <w:r>
         <w:rPr>
           <w:rFonts w:ascii="Calibri" w:eastAsia="Calibri" w:hAnsi="Calibri" w:cs="Calibri"/>
@@ -2637,6 +3915,7 @@
         </w:rPr>
         <w:t>phtest</w:t>
       </w:r>
+      <w:proofErr w:type="spellEnd"/>
       <w:r>
         <w:rPr>
           <w:rFonts w:ascii="Calibri" w:eastAsia="Calibri" w:hAnsi="Calibri" w:cs="Calibri"/>
@@ -2644,6 +3923,7 @@
         </w:rPr>
         <w:t>(</w:t>
       </w:r>
+      <w:proofErr w:type="spellStart"/>
       <w:r>
         <w:rPr>
           <w:rFonts w:ascii="Calibri" w:eastAsia="Calibri" w:hAnsi="Calibri" w:cs="Calibri"/>
@@ -2651,6 +3931,7 @@
         </w:rPr>
         <w:t>fe_model</w:t>
       </w:r>
+      <w:proofErr w:type="spellEnd"/>
       <w:r>
         <w:rPr>
           <w:rFonts w:ascii="Calibri" w:eastAsia="Calibri" w:hAnsi="Calibri" w:cs="Calibri"/>
@@ -2663,8 +3944,17 @@
           <w:rFonts w:ascii="Calibri" w:eastAsia="Calibri" w:hAnsi="Calibri" w:cs="Calibri"/>
           <w:color w:val="14181F"/>
         </w:rPr>
-        <w:t xml:space="preserve"> re_model</w:t>
-      </w:r>
+        <w:t xml:space="preserve"> </w:t>
+      </w:r>
+      <w:proofErr w:type="spellStart"/>
+      <w:r>
+        <w:rPr>
+          <w:rFonts w:ascii="Calibri" w:eastAsia="Calibri" w:hAnsi="Calibri" w:cs="Calibri"/>
+          <w:color w:val="14181F"/>
+        </w:rPr>
+        <w:t>re_model</w:t>
+      </w:r>
+      <w:proofErr w:type="spellEnd"/>
       <w:r>
         <w:rPr>
           <w:rFonts w:ascii="Calibri" w:eastAsia="Calibri" w:hAnsi="Calibri" w:cs="Calibri"/>
@@ -2694,7 +3984,25 @@
           <w:b/>
           <w:bCs/>
         </w:rPr>
-        <w:t>2. Cross-sectional dependence (Pesaran CD test):</w:t>
+        <w:t>2. Cross-sectional dependence (</w:t>
+      </w:r>
+      <w:proofErr w:type="spellStart"/>
+      <w:r>
+        <w:rPr>
+          <w:rFonts w:ascii="Calibri" w:eastAsia="Calibri" w:hAnsi="Calibri" w:cs="Calibri"/>
+          <w:b/>
+          <w:bCs/>
+        </w:rPr>
+        <w:t>Pesaran</w:t>
+      </w:r>
+      <w:proofErr w:type="spellEnd"/>
+      <w:r>
+        <w:rPr>
+          <w:rFonts w:ascii="Calibri" w:eastAsia="Calibri" w:hAnsi="Calibri" w:cs="Calibri"/>
+          <w:b/>
+          <w:bCs/>
+        </w:rPr>
+        <w:t xml:space="preserve"> CD test):</w:t>
       </w:r>
     </w:p>
     <w:p>
@@ -2706,6 +4014,7 @@
       </w:r>
     </w:p>
     <w:p>
+      <w:proofErr w:type="spellStart"/>
       <w:r>
         <w:rPr>
           <w:rFonts w:ascii="Calibri" w:eastAsia="Calibri" w:hAnsi="Calibri" w:cs="Calibri"/>
@@ -2713,6 +4022,7 @@
         </w:rPr>
         <w:t>pcdtest</w:t>
       </w:r>
+      <w:proofErr w:type="spellEnd"/>
       <w:r>
         <w:rPr>
           <w:rFonts w:ascii="Calibri" w:eastAsia="Calibri" w:hAnsi="Calibri" w:cs="Calibri"/>
@@ -2720,6 +4030,7 @@
         </w:rPr>
         <w:t>(</w:t>
       </w:r>
+      <w:proofErr w:type="spellStart"/>
       <w:r>
         <w:rPr>
           <w:rFonts w:ascii="Calibri" w:eastAsia="Calibri" w:hAnsi="Calibri" w:cs="Calibri"/>
@@ -2727,6 +4038,7 @@
         </w:rPr>
         <w:t>fe_model</w:t>
       </w:r>
+      <w:proofErr w:type="spellEnd"/>
       <w:r>
         <w:rPr>
           <w:rFonts w:ascii="Calibri" w:eastAsia="Calibri" w:hAnsi="Calibri" w:cs="Calibri"/>
@@ -2764,7 +4076,21 @@
         <w:rPr>
           <w:rFonts w:ascii="Calibri" w:eastAsia="Calibri" w:hAnsi="Calibri" w:cs="Calibri"/>
         </w:rPr>
-        <w:t>If significant, it means common shocks are creating cross-bank correlation beyond what year FE absorbs. Year FE largely handles this, but report the test result.</w:t>
+        <w:t xml:space="preserve">If significant, it means common </w:t>
+      </w:r>
+      <w:proofErr w:type="spellStart"/>
+      <w:r>
+        <w:rPr>
+          <w:rFonts w:ascii="Calibri" w:eastAsia="Calibri" w:hAnsi="Calibri" w:cs="Calibri"/>
+        </w:rPr>
+        <w:t>shocks</w:t>
+      </w:r>
+      <w:proofErr w:type="spellEnd"/>
+      <w:r>
+        <w:rPr>
+          <w:rFonts w:ascii="Calibri" w:eastAsia="Calibri" w:hAnsi="Calibri" w:cs="Calibri"/>
+        </w:rPr>
+        <w:t xml:space="preserve"> are creating cross-bank correlation beyond what year FE absorbs. Year FE largely handles this, but report the test result.</w:t>
       </w:r>
     </w:p>
     <w:p>
@@ -2789,6 +4115,7 @@
       </w:r>
     </w:p>
     <w:p>
+      <w:proofErr w:type="spellStart"/>
       <w:r>
         <w:rPr>
           <w:rFonts w:ascii="Calibri" w:eastAsia="Calibri" w:hAnsi="Calibri" w:cs="Calibri"/>
@@ -2796,6 +4123,7 @@
         </w:rPr>
         <w:t>pbgtest</w:t>
       </w:r>
+      <w:proofErr w:type="spellEnd"/>
       <w:r>
         <w:rPr>
           <w:rFonts w:ascii="Calibri" w:eastAsia="Calibri" w:hAnsi="Calibri" w:cs="Calibri"/>
@@ -2803,6 +4131,7 @@
         </w:rPr>
         <w:t>(</w:t>
       </w:r>
+      <w:proofErr w:type="spellStart"/>
       <w:r>
         <w:rPr>
           <w:rFonts w:ascii="Calibri" w:eastAsia="Calibri" w:hAnsi="Calibri" w:cs="Calibri"/>
@@ -2810,6 +4139,7 @@
         </w:rPr>
         <w:t>fe_model</w:t>
       </w:r>
+      <w:proofErr w:type="spellEnd"/>
       <w:r>
         <w:rPr>
           <w:rFonts w:ascii="Calibri" w:eastAsia="Calibri" w:hAnsi="Calibri" w:cs="Calibri"/>
@@ -2858,7 +4188,43 @@
           <w:b/>
           <w:bCs/>
         </w:rPr>
-        <w:t>5. Panel unit root (Im-Pesaran-Shin test):</w:t>
+        <w:t>5. Panel unit root (</w:t>
+      </w:r>
+      <w:proofErr w:type="spellStart"/>
+      <w:r>
+        <w:rPr>
+          <w:rFonts w:ascii="Calibri" w:eastAsia="Calibri" w:hAnsi="Calibri" w:cs="Calibri"/>
+          <w:b/>
+          <w:bCs/>
+        </w:rPr>
+        <w:t>Im</w:t>
+      </w:r>
+      <w:proofErr w:type="spellEnd"/>
+      <w:r>
+        <w:rPr>
+          <w:rFonts w:ascii="Calibri" w:eastAsia="Calibri" w:hAnsi="Calibri" w:cs="Calibri"/>
+          <w:b/>
+          <w:bCs/>
+        </w:rPr>
+        <w:t>-</w:t>
+      </w:r>
+      <w:proofErr w:type="spellStart"/>
+      <w:r>
+        <w:rPr>
+          <w:rFonts w:ascii="Calibri" w:eastAsia="Calibri" w:hAnsi="Calibri" w:cs="Calibri"/>
+          <w:b/>
+          <w:bCs/>
+        </w:rPr>
+        <w:t>Pesaran</w:t>
+      </w:r>
+      <w:proofErr w:type="spellEnd"/>
+      <w:r>
+        <w:rPr>
+          <w:rFonts w:ascii="Calibri" w:eastAsia="Calibri" w:hAnsi="Calibri" w:cs="Calibri"/>
+          <w:b/>
+          <w:bCs/>
+        </w:rPr>
+        <w:t>-Shin test):</w:t>
       </w:r>
     </w:p>
     <w:p>
@@ -2884,6 +4250,7 @@
         </w:rPr>
         <w:t>(</w:t>
       </w:r>
+      <w:proofErr w:type="spellStart"/>
       <w:r>
         <w:rPr>
           <w:rFonts w:ascii="Calibri" w:eastAsia="Calibri" w:hAnsi="Calibri" w:cs="Calibri"/>
@@ -2891,6 +4258,7 @@
         </w:rPr>
         <w:t>plm</w:t>
       </w:r>
+      <w:proofErr w:type="spellEnd"/>
       <w:r>
         <w:rPr>
           <w:rFonts w:ascii="Calibri" w:eastAsia="Calibri" w:hAnsi="Calibri" w:cs="Calibri"/>
@@ -2901,6 +4269,7 @@
       <w:r>
         <w:br/>
       </w:r>
+      <w:proofErr w:type="spellStart"/>
       <w:r>
         <w:rPr>
           <w:rFonts w:ascii="Calibri" w:eastAsia="Calibri" w:hAnsi="Calibri" w:cs="Calibri"/>
@@ -2908,6 +4277,7 @@
         </w:rPr>
         <w:t>purtest</w:t>
       </w:r>
+      <w:proofErr w:type="spellEnd"/>
       <w:r>
         <w:rPr>
           <w:rFonts w:ascii="Calibri" w:eastAsia="Calibri" w:hAnsi="Calibri" w:cs="Calibri"/>
@@ -2915,6 +4285,7 @@
         </w:rPr>
         <w:t>(</w:t>
       </w:r>
+      <w:proofErr w:type="spellStart"/>
       <w:r>
         <w:rPr>
           <w:rFonts w:ascii="Calibri" w:eastAsia="Calibri" w:hAnsi="Calibri" w:cs="Calibri"/>
@@ -2922,6 +4293,7 @@
         </w:rPr>
         <w:t>your_panel$Deposit_Ratio</w:t>
       </w:r>
+      <w:proofErr w:type="spellEnd"/>
       <w:r>
         <w:rPr>
           <w:rFonts w:ascii="Calibri" w:eastAsia="Calibri" w:hAnsi="Calibri" w:cs="Calibri"/>
@@ -2941,7 +4313,23 @@
           <w:rFonts w:ascii="Calibri" w:eastAsia="Calibri" w:hAnsi="Calibri" w:cs="Calibri"/>
           <w:color w:val="008000"/>
         </w:rPr>
-        <w:t>"ips"</w:t>
+        <w:t>"</w:t>
+      </w:r>
+      <w:proofErr w:type="spellStart"/>
+      <w:r>
+        <w:rPr>
+          <w:rFonts w:ascii="Calibri" w:eastAsia="Calibri" w:hAnsi="Calibri" w:cs="Calibri"/>
+          <w:color w:val="008000"/>
+        </w:rPr>
+        <w:t>ips</w:t>
+      </w:r>
+      <w:proofErr w:type="spellEnd"/>
+      <w:r>
+        <w:rPr>
+          <w:rFonts w:ascii="Calibri" w:eastAsia="Calibri" w:hAnsi="Calibri" w:cs="Calibri"/>
+          <w:color w:val="008000"/>
+        </w:rPr>
+        <w:t>"</w:t>
       </w:r>
       <w:r>
         <w:rPr>
@@ -2955,7 +4343,23 @@
           <w:rFonts w:ascii="Calibri" w:eastAsia="Calibri" w:hAnsi="Calibri" w:cs="Calibri"/>
           <w:color w:val="14181F"/>
         </w:rPr>
-        <w:t xml:space="preserve"> exo = </w:t>
+        <w:t xml:space="preserve"> </w:t>
+      </w:r>
+      <w:proofErr w:type="spellStart"/>
+      <w:r>
+        <w:rPr>
+          <w:rFonts w:ascii="Calibri" w:eastAsia="Calibri" w:hAnsi="Calibri" w:cs="Calibri"/>
+          <w:color w:val="14181F"/>
+        </w:rPr>
+        <w:t>exo</w:t>
+      </w:r>
+      <w:proofErr w:type="spellEnd"/>
+      <w:r>
+        <w:rPr>
+          <w:rFonts w:ascii="Calibri" w:eastAsia="Calibri" w:hAnsi="Calibri" w:cs="Calibri"/>
+          <w:color w:val="14181F"/>
+        </w:rPr>
+        <w:t xml:space="preserve"> = </w:t>
       </w:r>
       <w:r>
         <w:rPr>
@@ -2995,6 +4399,7 @@
       <w:r>
         <w:br/>
       </w:r>
+      <w:proofErr w:type="spellStart"/>
       <w:r>
         <w:rPr>
           <w:rFonts w:ascii="Calibri" w:eastAsia="Calibri" w:hAnsi="Calibri" w:cs="Calibri"/>
@@ -3002,6 +4407,7 @@
         </w:rPr>
         <w:t>purtest</w:t>
       </w:r>
+      <w:proofErr w:type="spellEnd"/>
       <w:r>
         <w:rPr>
           <w:rFonts w:ascii="Calibri" w:eastAsia="Calibri" w:hAnsi="Calibri" w:cs="Calibri"/>
@@ -3035,7 +4441,23 @@
           <w:rFonts w:ascii="Calibri" w:eastAsia="Calibri" w:hAnsi="Calibri" w:cs="Calibri"/>
           <w:color w:val="008000"/>
         </w:rPr>
-        <w:t>"ips"</w:t>
+        <w:t>"</w:t>
+      </w:r>
+      <w:proofErr w:type="spellStart"/>
+      <w:r>
+        <w:rPr>
+          <w:rFonts w:ascii="Calibri" w:eastAsia="Calibri" w:hAnsi="Calibri" w:cs="Calibri"/>
+          <w:color w:val="008000"/>
+        </w:rPr>
+        <w:t>ips</w:t>
+      </w:r>
+      <w:proofErr w:type="spellEnd"/>
+      <w:r>
+        <w:rPr>
+          <w:rFonts w:ascii="Calibri" w:eastAsia="Calibri" w:hAnsi="Calibri" w:cs="Calibri"/>
+          <w:color w:val="008000"/>
+        </w:rPr>
+        <w:t>"</w:t>
       </w:r>
       <w:r>
         <w:rPr>
@@ -3049,7 +4471,23 @@
           <w:rFonts w:ascii="Calibri" w:eastAsia="Calibri" w:hAnsi="Calibri" w:cs="Calibri"/>
           <w:color w:val="14181F"/>
         </w:rPr>
-        <w:t xml:space="preserve"> exo = </w:t>
+        <w:t xml:space="preserve"> </w:t>
+      </w:r>
+      <w:proofErr w:type="spellStart"/>
+      <w:r>
+        <w:rPr>
+          <w:rFonts w:ascii="Calibri" w:eastAsia="Calibri" w:hAnsi="Calibri" w:cs="Calibri"/>
+          <w:color w:val="14181F"/>
+        </w:rPr>
+        <w:t>exo</w:t>
+      </w:r>
+      <w:proofErr w:type="spellEnd"/>
+      <w:r>
+        <w:rPr>
+          <w:rFonts w:ascii="Calibri" w:eastAsia="Calibri" w:hAnsi="Calibri" w:cs="Calibri"/>
+          <w:color w:val="14181F"/>
+        </w:rPr>
+        <w:t xml:space="preserve"> = </w:t>
       </w:r>
       <w:r>
         <w:rPr>
@@ -3095,7 +4533,21 @@
         <w:rPr>
           <w:rFonts w:ascii="Calibri" w:eastAsia="Calibri" w:hAnsi="Calibri" w:cs="Calibri"/>
         </w:rPr>
-        <w:t>If Deposit_Ratio is I(1) (non-stationary), your regression is spurious unless the variables are cointegrated. Demographics trend upward and deposit ratios may also trend — test this and report it. For a master's paper, if you find non-stationarity, first-differencing or including a time trend is a defensible response.</w:t>
+        <w:t xml:space="preserve">If </w:t>
+      </w:r>
+      <w:proofErr w:type="spellStart"/>
+      <w:r>
+        <w:rPr>
+          <w:rFonts w:ascii="Calibri" w:eastAsia="Calibri" w:hAnsi="Calibri" w:cs="Calibri"/>
+        </w:rPr>
+        <w:t>Deposit_Ratio</w:t>
+      </w:r>
+      <w:proofErr w:type="spellEnd"/>
+      <w:r>
+        <w:rPr>
+          <w:rFonts w:ascii="Calibri" w:eastAsia="Calibri" w:hAnsi="Calibri" w:cs="Calibri"/>
+        </w:rPr>
+        <w:t xml:space="preserve"> is I(1) (non-stationary), your regression is spurious unless the variables are cointegrated. Demographics trend upward and deposit ratios may also trend — test this and report it. For a master's paper, if you find non-stationarity, first-differencing or including a time trend is a defensible response.</w:t>
       </w:r>
     </w:p>
     <w:p/>
@@ -3185,6 +4637,7 @@
         </w:rPr>
         <w:t>(</w:t>
       </w:r>
+      <w:proofErr w:type="spellStart"/>
       <w:r>
         <w:rPr>
           <w:rFonts w:ascii="Calibri" w:eastAsia="Calibri" w:hAnsi="Calibri" w:cs="Calibri"/>
@@ -3192,6 +4645,7 @@
         </w:rPr>
         <w:t>plm</w:t>
       </w:r>
+      <w:proofErr w:type="spellEnd"/>
       <w:r>
         <w:rPr>
           <w:rFonts w:ascii="Calibri" w:eastAsia="Calibri" w:hAnsi="Calibri" w:cs="Calibri"/>
@@ -3207,8 +4661,17 @@
           <w:rFonts w:ascii="Calibri" w:eastAsia="Calibri" w:hAnsi="Calibri" w:cs="Calibri"/>
           <w:color w:val="14181F"/>
         </w:rPr>
-        <w:t>pd &lt;- pdata.frame</w:t>
-      </w:r>
+        <w:t xml:space="preserve">pd &lt;- </w:t>
+      </w:r>
+      <w:proofErr w:type="spellStart"/>
+      <w:r>
+        <w:rPr>
+          <w:rFonts w:ascii="Calibri" w:eastAsia="Calibri" w:hAnsi="Calibri" w:cs="Calibri"/>
+          <w:color w:val="14181F"/>
+        </w:rPr>
+        <w:t>pdata.frame</w:t>
+      </w:r>
+      <w:proofErr w:type="spellEnd"/>
       <w:r>
         <w:rPr>
           <w:rFonts w:ascii="Calibri" w:eastAsia="Calibri" w:hAnsi="Calibri" w:cs="Calibri"/>
@@ -3216,6 +4679,7 @@
         </w:rPr>
         <w:t>(</w:t>
       </w:r>
+      <w:proofErr w:type="spellStart"/>
       <w:r>
         <w:rPr>
           <w:rFonts w:ascii="Calibri" w:eastAsia="Calibri" w:hAnsi="Calibri" w:cs="Calibri"/>
@@ -3223,6 +4687,7 @@
         </w:rPr>
         <w:t>your_data</w:t>
       </w:r>
+      <w:proofErr w:type="spellEnd"/>
       <w:r>
         <w:rPr>
           <w:rFonts w:ascii="Calibri" w:eastAsia="Calibri" w:hAnsi="Calibri" w:cs="Calibri"/>
@@ -3270,7 +4735,23 @@
           <w:rFonts w:ascii="Calibri" w:eastAsia="Calibri" w:hAnsi="Calibri" w:cs="Calibri"/>
           <w:color w:val="008000"/>
         </w:rPr>
-        <w:t>"fiscal_year"</w:t>
+        <w:t>"</w:t>
+      </w:r>
+      <w:proofErr w:type="spellStart"/>
+      <w:r>
+        <w:rPr>
+          <w:rFonts w:ascii="Calibri" w:eastAsia="Calibri" w:hAnsi="Calibri" w:cs="Calibri"/>
+          <w:color w:val="008000"/>
+        </w:rPr>
+        <w:t>fiscal_year</w:t>
+      </w:r>
+      <w:proofErr w:type="spellEnd"/>
+      <w:r>
+        <w:rPr>
+          <w:rFonts w:ascii="Calibri" w:eastAsia="Calibri" w:hAnsi="Calibri" w:cs="Calibri"/>
+          <w:color w:val="008000"/>
+        </w:rPr>
+        <w:t>"</w:t>
       </w:r>
       <w:r>
         <w:rPr>
@@ -3392,7 +4873,21 @@
         <w:rPr>
           <w:rFonts w:ascii="Calibri" w:eastAsia="Calibri" w:hAnsi="Calibri" w:cs="Calibri"/>
         </w:rPr>
-        <w:t xml:space="preserve"> showing the marginal effect of Age65 on Deposit_Ratio across the observed range of FinStructure values. In R:</w:t>
+        <w:t xml:space="preserve"> showing the marginal effect of Age65 on </w:t>
+      </w:r>
+      <w:proofErr w:type="spellStart"/>
+      <w:r>
+        <w:rPr>
+          <w:rFonts w:ascii="Calibri" w:eastAsia="Calibri" w:hAnsi="Calibri" w:cs="Calibri"/>
+        </w:rPr>
+        <w:t>Deposit_Ratio</w:t>
+      </w:r>
+      <w:proofErr w:type="spellEnd"/>
+      <w:r>
+        <w:rPr>
+          <w:rFonts w:ascii="Calibri" w:eastAsia="Calibri" w:hAnsi="Calibri" w:cs="Calibri"/>
+        </w:rPr>
+        <w:t xml:space="preserve"> across the observed range of FinStructure values. In R:</w:t>
       </w:r>
     </w:p>
     <w:p>
@@ -3418,6 +4913,7 @@
         </w:rPr>
         <w:t>(</w:t>
       </w:r>
+      <w:proofErr w:type="spellStart"/>
       <w:r>
         <w:rPr>
           <w:rFonts w:ascii="Calibri" w:eastAsia="Calibri" w:hAnsi="Calibri" w:cs="Calibri"/>
@@ -3425,6 +4921,7 @@
         </w:rPr>
         <w:t>marginaleffects</w:t>
       </w:r>
+      <w:proofErr w:type="spellEnd"/>
       <w:r>
         <w:rPr>
           <w:rFonts w:ascii="Calibri" w:eastAsia="Calibri" w:hAnsi="Calibri" w:cs="Calibri"/>
@@ -3435,6 +4932,7 @@
       <w:r>
         <w:br/>
       </w:r>
+      <w:proofErr w:type="spellStart"/>
       <w:r>
         <w:rPr>
           <w:rFonts w:ascii="Calibri" w:eastAsia="Calibri" w:hAnsi="Calibri" w:cs="Calibri"/>
@@ -3442,6 +4940,7 @@
         </w:rPr>
         <w:t>plot_slopes</w:t>
       </w:r>
+      <w:proofErr w:type="spellEnd"/>
       <w:r>
         <w:rPr>
           <w:rFonts w:ascii="Calibri" w:eastAsia="Calibri" w:hAnsi="Calibri" w:cs="Calibri"/>
@@ -3670,7 +5169,21 @@
         <w:rPr>
           <w:rFonts w:ascii="Calibri" w:eastAsia="Calibri" w:hAnsi="Calibri" w:cs="Calibri"/>
         </w:rPr>
-        <w:t xml:space="preserve"> If she flags country-level aging as too coarse, the NUTS-2 regional Eurostat demographic data (demo_r_pjanind) could be matched to banks by headquarter region — but only if SNL provides regional headquarters. Worth asking if she sees this as a necessary upgrade.</w:t>
+        <w:t xml:space="preserve"> If she flags country-level aging as too coarse, the NUTS-2 regional Eurostat demographic data (</w:t>
+      </w:r>
+      <w:proofErr w:type="spellStart"/>
+      <w:r>
+        <w:rPr>
+          <w:rFonts w:ascii="Calibri" w:eastAsia="Calibri" w:hAnsi="Calibri" w:cs="Calibri"/>
+        </w:rPr>
+        <w:t>demo_r_pjanind</w:t>
+      </w:r>
+      <w:proofErr w:type="spellEnd"/>
+      <w:r>
+        <w:rPr>
+          <w:rFonts w:ascii="Calibri" w:eastAsia="Calibri" w:hAnsi="Calibri" w:cs="Calibri"/>
+        </w:rPr>
+        <w:t>) could be matched to banks by headquarter region — but only if SNL provides regional headquarters. Worth asking if she sees this as a necessary upgrade.</w:t>
       </w:r>
     </w:p>
     <w:p/>
@@ -4084,7 +5597,7 @@
                     <pic:cNvPicPr/>
                   </pic:nvPicPr>
                   <pic:blipFill>
-                    <a:blip r:embed="rId12">
+                    <a:blip r:embed="rId17">
                       <a:extLst>
                         <a:ext uri="{28A0092B-C50C-407E-A947-70E740481C1C}">
                           <a14:useLocalDpi xmlns:a14="http://schemas.microsoft.com/office/drawing/2010/main"/>
@@ -4454,7 +5967,7 @@
         </w:rPr>
         <w:t xml:space="preserve">Please see topics in deck </w:t>
       </w:r>
-      <w:hyperlink r:id="rId13">
+      <w:hyperlink r:id="rId18">
         <w:r>
           <w:rPr>
             <w:rStyle w:val="Hyperlink"/>
@@ -4486,8 +5999,18 @@
           <w:bCs/>
           <w:color w:val="000000" w:themeColor="text1"/>
         </w:rPr>
-        <w:t>Let’s aim to agree by Wed EoD</w:t>
-      </w:r>
+        <w:t xml:space="preserve">Let’s aim to agree by Wed </w:t>
+      </w:r>
+      <w:proofErr w:type="spellStart"/>
+      <w:r>
+        <w:rPr>
+          <w:b/>
+          <w:bCs/>
+          <w:color w:val="000000" w:themeColor="text1"/>
+        </w:rPr>
+        <w:t>EoD</w:t>
+      </w:r>
+      <w:proofErr w:type="spellEnd"/>
     </w:p>
     <w:p>
       <w:pPr>
@@ -4590,7 +6113,7 @@
         </w:rPr>
         <w:t xml:space="preserve">Deliverables – see more info here: </w:t>
       </w:r>
-      <w:hyperlink r:id="rId14">
+      <w:hyperlink r:id="rId19">
         <w:r>
           <w:rPr>
             <w:rStyle w:val="Hyperlink"/>
@@ -4906,7 +6429,7 @@
         </w:rPr>
         <w:t xml:space="preserve">42, 174–190 (2018). </w:t>
       </w:r>
-      <w:hyperlink r:id="rId15">
+      <w:hyperlink r:id="rId20">
         <w:r>
           <w:rPr>
             <w:rStyle w:val="Hyperlink"/>
@@ -5088,7 +6611,15 @@
         </w:numPr>
       </w:pPr>
       <w:r>
-        <w:t xml:space="preserve">Do changes in the interest rate (or negative ir) impact bank profitability? </w:t>
+        <w:t xml:space="preserve">Do changes in the interest rate (or negative </w:t>
+      </w:r>
+      <w:proofErr w:type="spellStart"/>
+      <w:r>
+        <w:t>ir</w:t>
+      </w:r>
+      <w:proofErr w:type="spellEnd"/>
+      <w:r>
+        <w:t xml:space="preserve">) impact bank profitability? </w:t>
       </w:r>
       <w:r>
         <w:rPr>
@@ -5272,7 +6803,39 @@
           <w:i/>
           <w:iCs/>
         </w:rPr>
-        <w:t>NB: profitability, funding, lending, risk (etc) are interchangeable iff there is economic rationale</w:t>
+        <w:t>NB: profitability, funding, lending, risk (</w:t>
+      </w:r>
+      <w:proofErr w:type="spellStart"/>
+      <w:r>
+        <w:rPr>
+          <w:i/>
+          <w:iCs/>
+        </w:rPr>
+        <w:t>etc</w:t>
+      </w:r>
+      <w:proofErr w:type="spellEnd"/>
+      <w:r>
+        <w:rPr>
+          <w:i/>
+          <w:iCs/>
+        </w:rPr>
+        <w:t xml:space="preserve">) are interchangeable </w:t>
+      </w:r>
+      <w:proofErr w:type="spellStart"/>
+      <w:r>
+        <w:rPr>
+          <w:i/>
+          <w:iCs/>
+        </w:rPr>
+        <w:t>iff</w:t>
+      </w:r>
+      <w:proofErr w:type="spellEnd"/>
+      <w:r>
+        <w:rPr>
+          <w:i/>
+          <w:iCs/>
+        </w:rPr>
+        <w:t xml:space="preserve"> there is economic rationale</w:t>
       </w:r>
     </w:p>
     <w:p>
@@ -5335,7 +6898,7 @@
                     <pic:cNvPicPr/>
                   </pic:nvPicPr>
                   <pic:blipFill>
-                    <a:blip r:embed="rId16"/>
+                    <a:blip r:embed="rId21"/>
                     <a:stretch>
                       <a:fillRect/>
                     </a:stretch>
@@ -5403,7 +6966,15 @@
         <w:t>Top conferences:</w:t>
       </w:r>
       <w:r>
-        <w:t xml:space="preserve"> American Economic Association, American Finance Association, European Finance Association Meetings, International Banking Economic and Finance Association, CEPR-BIS-Gerzensee Conference in Financial Intermediation</w:t>
+        <w:t xml:space="preserve"> American Economic Association, American Finance Association, European Finance Association Meetings, International Banking Economic and Finance Association, CEPR-BIS-</w:t>
+      </w:r>
+      <w:proofErr w:type="spellStart"/>
+      <w:r>
+        <w:t>Gerzensee</w:t>
+      </w:r>
+      <w:proofErr w:type="spellEnd"/>
+      <w:r>
+        <w:t xml:space="preserve"> Conference in Financial Intermediation</w:t>
       </w:r>
     </w:p>
     <w:p/>
@@ -5425,8 +6996,13 @@
         <w:t xml:space="preserve"> Elicit</w:t>
       </w:r>
       <w:r>
-        <w:t>, Connected Papers, Litmaps</w:t>
-      </w:r>
+        <w:t xml:space="preserve">, Connected Papers, </w:t>
+      </w:r>
+      <w:proofErr w:type="spellStart"/>
+      <w:r>
+        <w:t>Litmaps</w:t>
+      </w:r>
+      <w:proofErr w:type="spellEnd"/>
     </w:p>
     <w:p>
       <w:pPr>
@@ -5503,7 +7079,7 @@
                     <pic:cNvPicPr/>
                   </pic:nvPicPr>
                   <pic:blipFill>
-                    <a:blip r:embed="rId17"/>
+                    <a:blip r:embed="rId22"/>
                     <a:stretch>
                       <a:fillRect/>
                     </a:stretch>
@@ -5577,7 +7153,7 @@
                     <pic:cNvPicPr/>
                   </pic:nvPicPr>
                   <pic:blipFill>
-                    <a:blip r:embed="rId18"/>
+                    <a:blip r:embed="rId23"/>
                     <a:stretch>
                       <a:fillRect/>
                     </a:stretch>
@@ -5624,6 +7200,48 @@
 </w:document>
 </file>
 
+<file path=word/comments.xml><?xml version="1.0" encoding="utf-8"?>
+<w:comments xmlns:wpc="http://schemas.microsoft.com/office/word/2010/wordprocessingCanvas" xmlns:cx="http://schemas.microsoft.com/office/drawing/2014/chartex" xmlns:cx1="http://schemas.microsoft.com/office/drawing/2015/9/8/chartex" xmlns:cx2="http://schemas.microsoft.com/office/drawing/2015/10/21/chartex" xmlns:cx3="http://schemas.microsoft.com/office/drawing/2016/5/9/chartex" xmlns:cx4="http://schemas.microsoft.com/office/drawing/2016/5/10/chartex" xmlns:cx5="http://schemas.microsoft.com/office/drawing/2016/5/11/chartex" xmlns:cx6="http://schemas.microsoft.com/office/drawing/2016/5/12/chartex" xmlns:cx7="http://schemas.microsoft.com/office/drawing/2016/5/13/chartex" xmlns:cx8="http://schemas.microsoft.com/office/drawing/2016/5/14/chartex" xmlns:mc="http://schemas.openxmlformats.org/markup-compatibility/2006" xmlns:aink="http://schemas.microsoft.com/office/drawing/2016/ink" xmlns:am3d="http://schemas.microsoft.com/office/drawing/2017/model3d" xmlns:o="urn:schemas-microsoft-com:office:office" xmlns:oel="http://schemas.microsoft.com/office/2019/extlst" xmlns:r="http://schemas.openxmlformats.org/officeDocument/2006/relationships" xmlns:m="http://schemas.openxmlformats.org/officeDocument/2006/math" xmlns:v="urn:schemas-microsoft-com:vml" xmlns:wp14="http://schemas.microsoft.com/office/word/2010/wordprocessingDrawing" xmlns:wp="http://schemas.openxmlformats.org/drawingml/2006/wordprocessingDrawing" xmlns:w10="urn:schemas-microsoft-com:office:word" xmlns:w="http://schemas.openxmlformats.org/wordprocessingml/2006/main" xmlns:w14="http://schemas.microsoft.com/office/word/2010/wordml" xmlns:w15="http://schemas.microsoft.com/office/word/2012/wordml" xmlns:w16cex="http://schemas.microsoft.com/office/word/2018/wordml/cex" xmlns:w16cid="http://schemas.microsoft.com/office/word/2016/wordml/cid" xmlns:w16="http://schemas.microsoft.com/office/word/2018/wordml" xmlns:w16du="http://schemas.microsoft.com/office/word/2023/wordml/word16du" xmlns:w16sdtdh="http://schemas.microsoft.com/office/word/2020/wordml/sdtdatahash" xmlns:w16sdtfl="http://schemas.microsoft.com/office/word/2024/wordml/sdtformatlock" xmlns:w16se="http://schemas.microsoft.com/office/word/2015/wordml/symex" xmlns:wpg="http://schemas.microsoft.com/office/word/2010/wordprocessingGroup" xmlns:wpi="http://schemas.microsoft.com/office/word/2010/wordprocessingInk" xmlns:wne="http://schemas.microsoft.com/office/word/2006/wordml" xmlns:wps="http://schemas.microsoft.com/office/word/2010/wordprocessingShape" mc:Ignorable="w14 w15 w16se w16cid w16 w16cex w16sdtdh w16sdtfl w16du wp14">
+  <w:comment w:id="0" w:author="Bruehlmann, Noel" w:date="2026-03-25T10:55:00Z" w:initials="NB">
+    <w:p>
+      <w:pPr>
+        <w:pStyle w:val="CommentText"/>
+      </w:pPr>
+      <w:r>
+        <w:rPr>
+          <w:rStyle w:val="CommentReference"/>
+        </w:rPr>
+        <w:annotationRef/>
+      </w:r>
+      <w:r>
+        <w:rPr>
+          <w:lang w:val="de-LI"/>
+        </w:rPr>
+        <w:t>TBD -&gt; potentially change, depending on what we want to show and how we want to specify the regression</w:t>
+      </w:r>
+    </w:p>
+  </w:comment>
+</w:comments>
+</file>
+
+<file path=word/commentsExtended.xml><?xml version="1.0" encoding="utf-8"?>
+<w15:commentsEx xmlns:wpc="http://schemas.microsoft.com/office/word/2010/wordprocessingCanvas" xmlns:cx="http://schemas.microsoft.com/office/drawing/2014/chartex" xmlns:cx1="http://schemas.microsoft.com/office/drawing/2015/9/8/chartex" xmlns:cx2="http://schemas.microsoft.com/office/drawing/2015/10/21/chartex" xmlns:cx3="http://schemas.microsoft.com/office/drawing/2016/5/9/chartex" xmlns:cx4="http://schemas.microsoft.com/office/drawing/2016/5/10/chartex" xmlns:cx5="http://schemas.microsoft.com/office/drawing/2016/5/11/chartex" xmlns:cx6="http://schemas.microsoft.com/office/drawing/2016/5/12/chartex" xmlns:cx7="http://schemas.microsoft.com/office/drawing/2016/5/13/chartex" xmlns:cx8="http://schemas.microsoft.com/office/drawing/2016/5/14/chartex" xmlns:mc="http://schemas.openxmlformats.org/markup-compatibility/2006" xmlns:aink="http://schemas.microsoft.com/office/drawing/2016/ink" xmlns:am3d="http://schemas.microsoft.com/office/drawing/2017/model3d" xmlns:o="urn:schemas-microsoft-com:office:office" xmlns:oel="http://schemas.microsoft.com/office/2019/extlst" xmlns:r="http://schemas.openxmlformats.org/officeDocument/2006/relationships" xmlns:m="http://schemas.openxmlformats.org/officeDocument/2006/math" xmlns:v="urn:schemas-microsoft-com:vml" xmlns:wp14="http://schemas.microsoft.com/office/word/2010/wordprocessingDrawing" xmlns:wp="http://schemas.openxmlformats.org/drawingml/2006/wordprocessingDrawing" xmlns:w10="urn:schemas-microsoft-com:office:word" xmlns:w="http://schemas.openxmlformats.org/wordprocessingml/2006/main" xmlns:w14="http://schemas.microsoft.com/office/word/2010/wordml" xmlns:w15="http://schemas.microsoft.com/office/word/2012/wordml" xmlns:w16cex="http://schemas.microsoft.com/office/word/2018/wordml/cex" xmlns:w16cid="http://schemas.microsoft.com/office/word/2016/wordml/cid" xmlns:w16="http://schemas.microsoft.com/office/word/2018/wordml" xmlns:w16du="http://schemas.microsoft.com/office/word/2023/wordml/word16du" xmlns:w16sdtdh="http://schemas.microsoft.com/office/word/2020/wordml/sdtdatahash" xmlns:w16sdtfl="http://schemas.microsoft.com/office/word/2024/wordml/sdtformatlock" xmlns:w16se="http://schemas.microsoft.com/office/word/2015/wordml/symex" xmlns:wpg="http://schemas.microsoft.com/office/word/2010/wordprocessingGroup" xmlns:wpi="http://schemas.microsoft.com/office/word/2010/wordprocessingInk" xmlns:wne="http://schemas.microsoft.com/office/word/2006/wordml" xmlns:wps="http://schemas.microsoft.com/office/word/2010/wordprocessingShape" mc:Ignorable="w14 w15 w16se w16cid w16 w16cex w16sdtdh w16sdtfl w16du wp14">
+  <w15:commentEx w15:paraId="6DE0A0C5" w15:done="0"/>
+</w15:commentsEx>
+</file>
+
+<file path=word/commentsExtensible.xml><?xml version="1.0" encoding="utf-8"?>
+<w16cex:commentsExtensible xmlns:wpc="http://schemas.microsoft.com/office/word/2010/wordprocessingCanvas" xmlns:cx="http://schemas.microsoft.com/office/drawing/2014/chartex" xmlns:cx1="http://schemas.microsoft.com/office/drawing/2015/9/8/chartex" xmlns:cx2="http://schemas.microsoft.com/office/drawing/2015/10/21/chartex" xmlns:cx3="http://schemas.microsoft.com/office/drawing/2016/5/9/chartex" xmlns:cx4="http://schemas.microsoft.com/office/drawing/2016/5/10/chartex" xmlns:cx5="http://schemas.microsoft.com/office/drawing/2016/5/11/chartex" xmlns:cx6="http://schemas.microsoft.com/office/drawing/2016/5/12/chartex" xmlns:cx7="http://schemas.microsoft.com/office/drawing/2016/5/13/chartex" xmlns:cx8="http://schemas.microsoft.com/office/drawing/2016/5/14/chartex" xmlns:cr="http://schemas.microsoft.com/office/comments/2020/reactions" xmlns:mc="http://schemas.openxmlformats.org/markup-compatibility/2006" xmlns:aink="http://schemas.microsoft.com/office/drawing/2016/ink" xmlns:am3d="http://schemas.microsoft.com/office/drawing/2017/model3d" xmlns:o="urn:schemas-microsoft-com:office:office" xmlns:oel="http://schemas.microsoft.com/office/2019/extlst" xmlns:r="http://schemas.openxmlformats.org/officeDocument/2006/relationships" xmlns:m="http://schemas.openxmlformats.org/officeDocument/2006/math" xmlns:v="urn:schemas-microsoft-com:vml" xmlns:wp14="http://schemas.microsoft.com/office/word/2010/wordprocessingDrawing" xmlns:wp="http://schemas.openxmlformats.org/drawingml/2006/wordprocessingDrawing" xmlns:w10="urn:schemas-microsoft-com:office:word" xmlns:w="http://schemas.openxmlformats.org/wordprocessingml/2006/main" xmlns:w14="http://schemas.microsoft.com/office/word/2010/wordml" xmlns:w15="http://schemas.microsoft.com/office/word/2012/wordml" xmlns:w16cex="http://schemas.microsoft.com/office/word/2018/wordml/cex" xmlns:w16cid="http://schemas.microsoft.com/office/word/2016/wordml/cid" xmlns:w16="http://schemas.microsoft.com/office/word/2018/wordml" xmlns:w16du="http://schemas.microsoft.com/office/word/2023/wordml/word16du" xmlns:w16sdtdh="http://schemas.microsoft.com/office/word/2020/wordml/sdtdatahash" xmlns:w16sdtfl="http://schemas.microsoft.com/office/word/2024/wordml/sdtformatlock" xmlns:w16se="http://schemas.microsoft.com/office/word/2015/wordml/symex" xmlns:wpg="http://schemas.microsoft.com/office/word/2010/wordprocessingGroup" xmlns:wpi="http://schemas.microsoft.com/office/word/2010/wordprocessingInk" xmlns:wne="http://schemas.microsoft.com/office/word/2006/wordml" xmlns:wps="http://schemas.microsoft.com/office/word/2010/wordprocessingShape" mc:Ignorable="w14 w15 w16se w16cid w16 w16cex w16sdtdh w16sdtfl cr w16du wp14">
+  <w16cex:commentExtensible w16cex:durableId="211DB15E" w16cex:dateUtc="2026-03-25T09:55:00Z"/>
+</w16cex:commentsExtensible>
+</file>
+
+<file path=word/commentsIds.xml><?xml version="1.0" encoding="utf-8"?>
+<w16cid:commentsIds xmlns:wpc="http://schemas.microsoft.com/office/word/2010/wordprocessingCanvas" xmlns:cx="http://schemas.microsoft.com/office/drawing/2014/chartex" xmlns:cx1="http://schemas.microsoft.com/office/drawing/2015/9/8/chartex" xmlns:cx2="http://schemas.microsoft.com/office/drawing/2015/10/21/chartex" xmlns:cx3="http://schemas.microsoft.com/office/drawing/2016/5/9/chartex" xmlns:cx4="http://schemas.microsoft.com/office/drawing/2016/5/10/chartex" xmlns:cx5="http://schemas.microsoft.com/office/drawing/2016/5/11/chartex" xmlns:cx6="http://schemas.microsoft.com/office/drawing/2016/5/12/chartex" xmlns:cx7="http://schemas.microsoft.com/office/drawing/2016/5/13/chartex" xmlns:cx8="http://schemas.microsoft.com/office/drawing/2016/5/14/chartex" xmlns:mc="http://schemas.openxmlformats.org/markup-compatibility/2006" xmlns:aink="http://schemas.microsoft.com/office/drawing/2016/ink" xmlns:am3d="http://schemas.microsoft.com/office/drawing/2017/model3d" xmlns:o="urn:schemas-microsoft-com:office:office" xmlns:oel="http://schemas.microsoft.com/office/2019/extlst" xmlns:r="http://schemas.openxmlformats.org/officeDocument/2006/relationships" xmlns:m="http://schemas.openxmlformats.org/officeDocument/2006/math" xmlns:v="urn:schemas-microsoft-com:vml" xmlns:wp14="http://schemas.microsoft.com/office/word/2010/wordprocessingDrawing" xmlns:wp="http://schemas.openxmlformats.org/drawingml/2006/wordprocessingDrawing" xmlns:w10="urn:schemas-microsoft-com:office:word" xmlns:w="http://schemas.openxmlformats.org/wordprocessingml/2006/main" xmlns:w14="http://schemas.microsoft.com/office/word/2010/wordml" xmlns:w15="http://schemas.microsoft.com/office/word/2012/wordml" xmlns:w16cex="http://schemas.microsoft.com/office/word/2018/wordml/cex" xmlns:w16cid="http://schemas.microsoft.com/office/word/2016/wordml/cid" xmlns:w16="http://schemas.microsoft.com/office/word/2018/wordml" xmlns:w16du="http://schemas.microsoft.com/office/word/2023/wordml/word16du" xmlns:w16sdtdh="http://schemas.microsoft.com/office/word/2020/wordml/sdtdatahash" xmlns:w16sdtfl="http://schemas.microsoft.com/office/word/2024/wordml/sdtformatlock" xmlns:w16se="http://schemas.microsoft.com/office/word/2015/wordml/symex" xmlns:wpg="http://schemas.microsoft.com/office/word/2010/wordprocessingGroup" xmlns:wpi="http://schemas.microsoft.com/office/word/2010/wordprocessingInk" xmlns:wne="http://schemas.microsoft.com/office/word/2006/wordml" xmlns:wps="http://schemas.microsoft.com/office/word/2010/wordprocessingShape" mc:Ignorable="w14 w15 w16se w16cid w16 w16cex w16sdtdh w16sdtfl w16du wp14">
+  <w16cid:commentId w16cid:paraId="6DE0A0C5" w16cid:durableId="211DB15E"/>
+</w16cid:commentsIds>
+</file>
+
 <file path=word/numbering.xml><?xml version="1.0" encoding="utf-8"?>
 <w:numbering xmlns:wpc="http://schemas.microsoft.com/office/word/2010/wordprocessingCanvas" xmlns:cx="http://schemas.microsoft.com/office/drawing/2014/chartex" xmlns:cx1="http://schemas.microsoft.com/office/drawing/2015/9/8/chartex" xmlns:cx2="http://schemas.microsoft.com/office/drawing/2015/10/21/chartex" xmlns:cx3="http://schemas.microsoft.com/office/drawing/2016/5/9/chartex" xmlns:cx4="http://schemas.microsoft.com/office/drawing/2016/5/10/chartex" xmlns:cx5="http://schemas.microsoft.com/office/drawing/2016/5/11/chartex" xmlns:cx6="http://schemas.microsoft.com/office/drawing/2016/5/12/chartex" xmlns:cx7="http://schemas.microsoft.com/office/drawing/2016/5/13/chartex" xmlns:cx8="http://schemas.microsoft.com/office/drawing/2016/5/14/chartex" xmlns:mc="http://schemas.openxmlformats.org/markup-compatibility/2006" xmlns:aink="http://schemas.microsoft.com/office/drawing/2016/ink" xmlns:am3d="http://schemas.microsoft.com/office/drawing/2017/model3d" xmlns:o="urn:schemas-microsoft-com:office:office" xmlns:oel="http://schemas.microsoft.com/office/2019/extlst" xmlns:r="http://schemas.openxmlformats.org/officeDocument/2006/relationships" xmlns:m="http://schemas.openxmlformats.org/officeDocument/2006/math" xmlns:v="urn:schemas-microsoft-com:vml" xmlns:wp14="http://schemas.microsoft.com/office/word/2010/wordprocessingDrawing" xmlns:wp="http://schemas.openxmlformats.org/drawingml/2006/wordprocessingDrawing" xmlns:w10="urn:schemas-microsoft-com:office:word" xmlns:w="http://schemas.openxmlformats.org/wordprocessingml/2006/main" xmlns:w14="http://schemas.microsoft.com/office/word/2010/wordml" xmlns:w15="http://schemas.microsoft.com/office/word/2012/wordml" xmlns:w16cex="http://schemas.microsoft.com/office/word/2018/wordml/cex" xmlns:w16cid="http://schemas.microsoft.com/office/word/2016/wordml/cid" xmlns:w16="http://schemas.microsoft.com/office/word/2018/wordml" xmlns:w16du="http://schemas.microsoft.com/office/word/2023/wordml/word16du" xmlns:w16sdtdh="http://schemas.microsoft.com/office/word/2020/wordml/sdtdatahash" xmlns:w16sdtfl="http://schemas.microsoft.com/office/word/2024/wordml/sdtformatlock" xmlns:w16se="http://schemas.microsoft.com/office/word/2015/wordml/symex" xmlns:wpg="http://schemas.microsoft.com/office/word/2010/wordprocessingGroup" xmlns:wpi="http://schemas.microsoft.com/office/word/2010/wordprocessingInk" xmlns:wne="http://schemas.microsoft.com/office/word/2006/wordml" xmlns:wps="http://schemas.microsoft.com/office/word/2010/wordprocessingShape" mc:Ignorable="w14 w15 w16se w16cid w16 w16cex w16sdtdh w16sdtfl w16du wp14">
   <w:abstractNum w:abstractNumId="0" w15:restartNumberingAfterBreak="0">
@@ -6960,7 +8578,7 @@
         <w:rFonts w:ascii="Courier New" w:hAnsi="Courier New" w:cs="Courier New" w:hint="default"/>
       </w:rPr>
     </w:lvl>
-    <w:lvl w:ilvl="2" w:tplc="20000005" w:tentative="1">
+    <w:lvl w:ilvl="2" w:tplc="20000005">
       <w:start w:val="1"/>
       <w:numFmt w:val="bullet"/>
       <w:lvlText w:val=""/>
@@ -7135,6 +8753,119 @@
     </w:lvl>
   </w:abstractNum>
   <w:abstractNum w:abstractNumId="14" w15:restartNumberingAfterBreak="0">
+    <w:nsid w:val="498E0A55"/>
+    <w:multiLevelType w:val="hybridMultilevel"/>
+    <w:tmpl w:val="D68EA310"/>
+    <w:lvl w:ilvl="0" w:tplc="20000001">
+      <w:start w:val="1"/>
+      <w:numFmt w:val="bullet"/>
+      <w:lvlText w:val=""/>
+      <w:lvlJc w:val="left"/>
+      <w:pPr>
+        <w:ind w:left="720" w:hanging="360"/>
+      </w:pPr>
+      <w:rPr>
+        <w:rFonts w:ascii="Symbol" w:hAnsi="Symbol" w:hint="default"/>
+      </w:rPr>
+    </w:lvl>
+    <w:lvl w:ilvl="1" w:tplc="20000003" w:tentative="1">
+      <w:start w:val="1"/>
+      <w:numFmt w:val="bullet"/>
+      <w:lvlText w:val="o"/>
+      <w:lvlJc w:val="left"/>
+      <w:pPr>
+        <w:ind w:left="1440" w:hanging="360"/>
+      </w:pPr>
+      <w:rPr>
+        <w:rFonts w:ascii="Courier New" w:hAnsi="Courier New" w:cs="Courier New" w:hint="default"/>
+      </w:rPr>
+    </w:lvl>
+    <w:lvl w:ilvl="2" w:tplc="20000005" w:tentative="1">
+      <w:start w:val="1"/>
+      <w:numFmt w:val="bullet"/>
+      <w:lvlText w:val=""/>
+      <w:lvlJc w:val="left"/>
+      <w:pPr>
+        <w:ind w:left="2160" w:hanging="360"/>
+      </w:pPr>
+      <w:rPr>
+        <w:rFonts w:ascii="Wingdings" w:hAnsi="Wingdings" w:hint="default"/>
+      </w:rPr>
+    </w:lvl>
+    <w:lvl w:ilvl="3" w:tplc="20000001" w:tentative="1">
+      <w:start w:val="1"/>
+      <w:numFmt w:val="bullet"/>
+      <w:lvlText w:val=""/>
+      <w:lvlJc w:val="left"/>
+      <w:pPr>
+        <w:ind w:left="2880" w:hanging="360"/>
+      </w:pPr>
+      <w:rPr>
+        <w:rFonts w:ascii="Symbol" w:hAnsi="Symbol" w:hint="default"/>
+      </w:rPr>
+    </w:lvl>
+    <w:lvl w:ilvl="4" w:tplc="20000003" w:tentative="1">
+      <w:start w:val="1"/>
+      <w:numFmt w:val="bullet"/>
+      <w:lvlText w:val="o"/>
+      <w:lvlJc w:val="left"/>
+      <w:pPr>
+        <w:ind w:left="3600" w:hanging="360"/>
+      </w:pPr>
+      <w:rPr>
+        <w:rFonts w:ascii="Courier New" w:hAnsi="Courier New" w:cs="Courier New" w:hint="default"/>
+      </w:rPr>
+    </w:lvl>
+    <w:lvl w:ilvl="5" w:tplc="20000005" w:tentative="1">
+      <w:start w:val="1"/>
+      <w:numFmt w:val="bullet"/>
+      <w:lvlText w:val=""/>
+      <w:lvlJc w:val="left"/>
+      <w:pPr>
+        <w:ind w:left="4320" w:hanging="360"/>
+      </w:pPr>
+      <w:rPr>
+        <w:rFonts w:ascii="Wingdings" w:hAnsi="Wingdings" w:hint="default"/>
+      </w:rPr>
+    </w:lvl>
+    <w:lvl w:ilvl="6" w:tplc="20000001" w:tentative="1">
+      <w:start w:val="1"/>
+      <w:numFmt w:val="bullet"/>
+      <w:lvlText w:val=""/>
+      <w:lvlJc w:val="left"/>
+      <w:pPr>
+        <w:ind w:left="5040" w:hanging="360"/>
+      </w:pPr>
+      <w:rPr>
+        <w:rFonts w:ascii="Symbol" w:hAnsi="Symbol" w:hint="default"/>
+      </w:rPr>
+    </w:lvl>
+    <w:lvl w:ilvl="7" w:tplc="20000003" w:tentative="1">
+      <w:start w:val="1"/>
+      <w:numFmt w:val="bullet"/>
+      <w:lvlText w:val="o"/>
+      <w:lvlJc w:val="left"/>
+      <w:pPr>
+        <w:ind w:left="5760" w:hanging="360"/>
+      </w:pPr>
+      <w:rPr>
+        <w:rFonts w:ascii="Courier New" w:hAnsi="Courier New" w:cs="Courier New" w:hint="default"/>
+      </w:rPr>
+    </w:lvl>
+    <w:lvl w:ilvl="8" w:tplc="20000005" w:tentative="1">
+      <w:start w:val="1"/>
+      <w:numFmt w:val="bullet"/>
+      <w:lvlText w:val=""/>
+      <w:lvlJc w:val="left"/>
+      <w:pPr>
+        <w:ind w:left="6480" w:hanging="360"/>
+      </w:pPr>
+      <w:rPr>
+        <w:rFonts w:ascii="Wingdings" w:hAnsi="Wingdings" w:hint="default"/>
+      </w:rPr>
+    </w:lvl>
+  </w:abstractNum>
+  <w:abstractNum w:abstractNumId="15" w15:restartNumberingAfterBreak="0">
     <w:nsid w:val="4B18119A"/>
     <w:multiLevelType w:val="hybridMultilevel"/>
     <w:tmpl w:val="5A947930"/>
@@ -7224,7 +8955,7 @@
       </w:pPr>
     </w:lvl>
   </w:abstractNum>
-  <w:abstractNum w:abstractNumId="15" w15:restartNumberingAfterBreak="0">
+  <w:abstractNum w:abstractNumId="16" w15:restartNumberingAfterBreak="0">
     <w:nsid w:val="4B19BD22"/>
     <w:multiLevelType w:val="hybridMultilevel"/>
     <w:tmpl w:val="EF1228BA"/>
@@ -7337,7 +9068,7 @@
       </w:rPr>
     </w:lvl>
   </w:abstractNum>
-  <w:abstractNum w:abstractNumId="16" w15:restartNumberingAfterBreak="0">
+  <w:abstractNum w:abstractNumId="17" w15:restartNumberingAfterBreak="0">
     <w:nsid w:val="4D480FF9"/>
     <w:multiLevelType w:val="hybridMultilevel"/>
     <w:tmpl w:val="CE647EB0"/>
@@ -7450,7 +9181,7 @@
       </w:rPr>
     </w:lvl>
   </w:abstractNum>
-  <w:abstractNum w:abstractNumId="17" w15:restartNumberingAfterBreak="0">
+  <w:abstractNum w:abstractNumId="18" w15:restartNumberingAfterBreak="0">
     <w:nsid w:val="5D35C3D8"/>
     <w:multiLevelType w:val="hybridMultilevel"/>
     <w:tmpl w:val="FFFFFFFF"/>
@@ -7536,7 +9267,7 @@
       </w:pPr>
     </w:lvl>
   </w:abstractNum>
-  <w:abstractNum w:abstractNumId="18" w15:restartNumberingAfterBreak="0">
+  <w:abstractNum w:abstractNumId="19" w15:restartNumberingAfterBreak="0">
     <w:nsid w:val="61D74826"/>
     <w:multiLevelType w:val="hybridMultilevel"/>
     <w:tmpl w:val="85DE16B0"/>
@@ -7649,7 +9380,96 @@
       </w:rPr>
     </w:lvl>
   </w:abstractNum>
-  <w:abstractNum w:abstractNumId="19" w15:restartNumberingAfterBreak="0">
+  <w:abstractNum w:abstractNumId="20" w15:restartNumberingAfterBreak="0">
+    <w:nsid w:val="659D775A"/>
+    <w:multiLevelType w:val="hybridMultilevel"/>
+    <w:tmpl w:val="500A0538"/>
+    <w:lvl w:ilvl="0" w:tplc="20000011">
+      <w:start w:val="1"/>
+      <w:numFmt w:val="decimal"/>
+      <w:lvlText w:val="%1)"/>
+      <w:lvlJc w:val="left"/>
+      <w:pPr>
+        <w:ind w:left="720" w:hanging="360"/>
+      </w:pPr>
+      <w:rPr>
+        <w:rFonts w:hint="default"/>
+      </w:rPr>
+    </w:lvl>
+    <w:lvl w:ilvl="1" w:tplc="20000019" w:tentative="1">
+      <w:start w:val="1"/>
+      <w:numFmt w:val="lowerLetter"/>
+      <w:lvlText w:val="%2."/>
+      <w:lvlJc w:val="left"/>
+      <w:pPr>
+        <w:ind w:left="1440" w:hanging="360"/>
+      </w:pPr>
+    </w:lvl>
+    <w:lvl w:ilvl="2" w:tplc="2000001B" w:tentative="1">
+      <w:start w:val="1"/>
+      <w:numFmt w:val="lowerRoman"/>
+      <w:lvlText w:val="%3."/>
+      <w:lvlJc w:val="right"/>
+      <w:pPr>
+        <w:ind w:left="2160" w:hanging="180"/>
+      </w:pPr>
+    </w:lvl>
+    <w:lvl w:ilvl="3" w:tplc="2000000F" w:tentative="1">
+      <w:start w:val="1"/>
+      <w:numFmt w:val="decimal"/>
+      <w:lvlText w:val="%4."/>
+      <w:lvlJc w:val="left"/>
+      <w:pPr>
+        <w:ind w:left="2880" w:hanging="360"/>
+      </w:pPr>
+    </w:lvl>
+    <w:lvl w:ilvl="4" w:tplc="20000019" w:tentative="1">
+      <w:start w:val="1"/>
+      <w:numFmt w:val="lowerLetter"/>
+      <w:lvlText w:val="%5."/>
+      <w:lvlJc w:val="left"/>
+      <w:pPr>
+        <w:ind w:left="3600" w:hanging="360"/>
+      </w:pPr>
+    </w:lvl>
+    <w:lvl w:ilvl="5" w:tplc="2000001B" w:tentative="1">
+      <w:start w:val="1"/>
+      <w:numFmt w:val="lowerRoman"/>
+      <w:lvlText w:val="%6."/>
+      <w:lvlJc w:val="right"/>
+      <w:pPr>
+        <w:ind w:left="4320" w:hanging="180"/>
+      </w:pPr>
+    </w:lvl>
+    <w:lvl w:ilvl="6" w:tplc="2000000F" w:tentative="1">
+      <w:start w:val="1"/>
+      <w:numFmt w:val="decimal"/>
+      <w:lvlText w:val="%7."/>
+      <w:lvlJc w:val="left"/>
+      <w:pPr>
+        <w:ind w:left="5040" w:hanging="360"/>
+      </w:pPr>
+    </w:lvl>
+    <w:lvl w:ilvl="7" w:tplc="20000019" w:tentative="1">
+      <w:start w:val="1"/>
+      <w:numFmt w:val="lowerLetter"/>
+      <w:lvlText w:val="%8."/>
+      <w:lvlJc w:val="left"/>
+      <w:pPr>
+        <w:ind w:left="5760" w:hanging="360"/>
+      </w:pPr>
+    </w:lvl>
+    <w:lvl w:ilvl="8" w:tplc="2000001B" w:tentative="1">
+      <w:start w:val="1"/>
+      <w:numFmt w:val="lowerRoman"/>
+      <w:lvlText w:val="%9."/>
+      <w:lvlJc w:val="right"/>
+      <w:pPr>
+        <w:ind w:left="6480" w:hanging="180"/>
+      </w:pPr>
+    </w:lvl>
+  </w:abstractNum>
+  <w:abstractNum w:abstractNumId="21" w15:restartNumberingAfterBreak="0">
     <w:nsid w:val="693C9EE9"/>
     <w:multiLevelType w:val="hybridMultilevel"/>
     <w:tmpl w:val="FFFFFFFF"/>
@@ -7735,7 +9555,7 @@
       </w:pPr>
     </w:lvl>
   </w:abstractNum>
-  <w:abstractNum w:abstractNumId="20" w15:restartNumberingAfterBreak="0">
+  <w:abstractNum w:abstractNumId="22" w15:restartNumberingAfterBreak="0">
     <w:nsid w:val="6BE0E497"/>
     <w:multiLevelType w:val="hybridMultilevel"/>
     <w:tmpl w:val="FFFFFFFF"/>
@@ -7848,7 +9668,7 @@
       </w:rPr>
     </w:lvl>
   </w:abstractNum>
-  <w:abstractNum w:abstractNumId="21" w15:restartNumberingAfterBreak="0">
+  <w:abstractNum w:abstractNumId="23" w15:restartNumberingAfterBreak="0">
     <w:nsid w:val="6C905813"/>
     <w:multiLevelType w:val="hybridMultilevel"/>
     <w:tmpl w:val="FFFFFFFF"/>
@@ -7934,7 +9754,7 @@
       </w:pPr>
     </w:lvl>
   </w:abstractNum>
-  <w:abstractNum w:abstractNumId="22" w15:restartNumberingAfterBreak="0">
+  <w:abstractNum w:abstractNumId="24" w15:restartNumberingAfterBreak="0">
     <w:nsid w:val="70CE0ED5"/>
     <w:multiLevelType w:val="hybridMultilevel"/>
     <w:tmpl w:val="FFFFFFFF"/>
@@ -8047,7 +9867,7 @@
       </w:rPr>
     </w:lvl>
   </w:abstractNum>
-  <w:abstractNum w:abstractNumId="23" w15:restartNumberingAfterBreak="0">
+  <w:abstractNum w:abstractNumId="25" w15:restartNumberingAfterBreak="0">
     <w:nsid w:val="728BBAB1"/>
     <w:multiLevelType w:val="hybridMultilevel"/>
     <w:tmpl w:val="FFFFFFFF"/>
@@ -8160,7 +9980,7 @@
       </w:rPr>
     </w:lvl>
   </w:abstractNum>
-  <w:abstractNum w:abstractNumId="24" w15:restartNumberingAfterBreak="0">
+  <w:abstractNum w:abstractNumId="26" w15:restartNumberingAfterBreak="0">
     <w:nsid w:val="799F7659"/>
     <w:multiLevelType w:val="hybridMultilevel"/>
     <w:tmpl w:val="FFFFFFFF"/>
@@ -8274,13 +10094,13 @@
     </w:lvl>
   </w:abstractNum>
   <w:num w:numId="1" w16cid:durableId="1359232233">
-    <w:abstractNumId w:val="21"/>
+    <w:abstractNumId w:val="23"/>
   </w:num>
   <w:num w:numId="2" w16cid:durableId="700712078">
-    <w:abstractNumId w:val="24"/>
+    <w:abstractNumId w:val="26"/>
   </w:num>
   <w:num w:numId="3" w16cid:durableId="668025130">
-    <w:abstractNumId w:val="23"/>
+    <w:abstractNumId w:val="25"/>
   </w:num>
   <w:num w:numId="4" w16cid:durableId="1547795368">
     <w:abstractNumId w:val="1"/>
@@ -8298,31 +10118,31 @@
     <w:abstractNumId w:val="8"/>
   </w:num>
   <w:num w:numId="9" w16cid:durableId="600914246">
-    <w:abstractNumId w:val="20"/>
+    <w:abstractNumId w:val="22"/>
   </w:num>
   <w:num w:numId="10" w16cid:durableId="1218054447">
-    <w:abstractNumId w:val="22"/>
+    <w:abstractNumId w:val="24"/>
   </w:num>
   <w:num w:numId="11" w16cid:durableId="1805542313">
     <w:abstractNumId w:val="4"/>
   </w:num>
   <w:num w:numId="12" w16cid:durableId="780151696">
-    <w:abstractNumId w:val="19"/>
+    <w:abstractNumId w:val="21"/>
   </w:num>
   <w:num w:numId="13" w16cid:durableId="277445021">
-    <w:abstractNumId w:val="17"/>
+    <w:abstractNumId w:val="18"/>
   </w:num>
   <w:num w:numId="14" w16cid:durableId="1101489022">
     <w:abstractNumId w:val="10"/>
   </w:num>
   <w:num w:numId="15" w16cid:durableId="268002429">
-    <w:abstractNumId w:val="16"/>
+    <w:abstractNumId w:val="17"/>
   </w:num>
   <w:num w:numId="16" w16cid:durableId="2115706889">
     <w:abstractNumId w:val="2"/>
   </w:num>
   <w:num w:numId="17" w16cid:durableId="1171598616">
-    <w:abstractNumId w:val="14"/>
+    <w:abstractNumId w:val="15"/>
   </w:num>
   <w:num w:numId="18" w16cid:durableId="1171263045">
     <w:abstractNumId w:val="6"/>
@@ -8334,10 +10154,10 @@
     <w:abstractNumId w:val="7"/>
   </w:num>
   <w:num w:numId="21" w16cid:durableId="911357169">
-    <w:abstractNumId w:val="18"/>
+    <w:abstractNumId w:val="19"/>
   </w:num>
   <w:num w:numId="22" w16cid:durableId="1689064806">
-    <w:abstractNumId w:val="15"/>
+    <w:abstractNumId w:val="16"/>
   </w:num>
   <w:num w:numId="23" w16cid:durableId="1289706209">
     <w:abstractNumId w:val="12"/>
@@ -8348,7 +10168,21 @@
   <w:num w:numId="25" w16cid:durableId="280844480">
     <w:abstractNumId w:val="0"/>
   </w:num>
+  <w:num w:numId="26" w16cid:durableId="1642617545">
+    <w:abstractNumId w:val="20"/>
+  </w:num>
+  <w:num w:numId="27" w16cid:durableId="2047827305">
+    <w:abstractNumId w:val="14"/>
+  </w:num>
 </w:numbering>
+</file>
+
+<file path=word/people.xml><?xml version="1.0" encoding="utf-8"?>
+<w15:people xmlns:wpc="http://schemas.microsoft.com/office/word/2010/wordprocessingCanvas" xmlns:cx="http://schemas.microsoft.com/office/drawing/2014/chartex" xmlns:cx1="http://schemas.microsoft.com/office/drawing/2015/9/8/chartex" xmlns:cx2="http://schemas.microsoft.com/office/drawing/2015/10/21/chartex" xmlns:cx3="http://schemas.microsoft.com/office/drawing/2016/5/9/chartex" xmlns:cx4="http://schemas.microsoft.com/office/drawing/2016/5/10/chartex" xmlns:cx5="http://schemas.microsoft.com/office/drawing/2016/5/11/chartex" xmlns:cx6="http://schemas.microsoft.com/office/drawing/2016/5/12/chartex" xmlns:cx7="http://schemas.microsoft.com/office/drawing/2016/5/13/chartex" xmlns:cx8="http://schemas.microsoft.com/office/drawing/2016/5/14/chartex" xmlns:mc="http://schemas.openxmlformats.org/markup-compatibility/2006" xmlns:aink="http://schemas.microsoft.com/office/drawing/2016/ink" xmlns:am3d="http://schemas.microsoft.com/office/drawing/2017/model3d" xmlns:o="urn:schemas-microsoft-com:office:office" xmlns:oel="http://schemas.microsoft.com/office/2019/extlst" xmlns:r="http://schemas.openxmlformats.org/officeDocument/2006/relationships" xmlns:m="http://schemas.openxmlformats.org/officeDocument/2006/math" xmlns:v="urn:schemas-microsoft-com:vml" xmlns:wp14="http://schemas.microsoft.com/office/word/2010/wordprocessingDrawing" xmlns:wp="http://schemas.openxmlformats.org/drawingml/2006/wordprocessingDrawing" xmlns:w10="urn:schemas-microsoft-com:office:word" xmlns:w="http://schemas.openxmlformats.org/wordprocessingml/2006/main" xmlns:w14="http://schemas.microsoft.com/office/word/2010/wordml" xmlns:w15="http://schemas.microsoft.com/office/word/2012/wordml" xmlns:w16cex="http://schemas.microsoft.com/office/word/2018/wordml/cex" xmlns:w16cid="http://schemas.microsoft.com/office/word/2016/wordml/cid" xmlns:w16="http://schemas.microsoft.com/office/word/2018/wordml" xmlns:w16du="http://schemas.microsoft.com/office/word/2023/wordml/word16du" xmlns:w16sdtdh="http://schemas.microsoft.com/office/word/2020/wordml/sdtdatahash" xmlns:w16sdtfl="http://schemas.microsoft.com/office/word/2024/wordml/sdtformatlock" xmlns:w16se="http://schemas.microsoft.com/office/word/2015/wordml/symex" xmlns:wpg="http://schemas.microsoft.com/office/word/2010/wordprocessingGroup" xmlns:wpi="http://schemas.microsoft.com/office/word/2010/wordprocessingInk" xmlns:wne="http://schemas.microsoft.com/office/word/2006/wordml" xmlns:wps="http://schemas.microsoft.com/office/word/2010/wordprocessingShape" mc:Ignorable="w14 w15 w16se w16cid w16 w16cex w16sdtdh w16sdtfl w16du wp14">
+  <w15:person w15:author="Bruehlmann, Noel">
+    <w15:presenceInfo w15:providerId="AD" w15:userId="S::noel.bruehlmann@student.unisg.ch::b9a2743c-8098-4e2e-a1f0-b3a2a0076be3"/>
+  </w15:person>
+</w15:people>
 </file>
 
 <file path=word/styles.xml><?xml version="1.0" encoding="utf-8"?>
@@ -9287,6 +11121,69 @@
       <w:u w:val="single"/>
     </w:rPr>
   </w:style>
+  <w:style w:type="character" w:styleId="CommentReference">
+    <w:name w:val="annotation reference"/>
+    <w:basedOn w:val="DefaultParagraphFont"/>
+    <w:uiPriority w:val="99"/>
+    <w:semiHidden/>
+    <w:unhideWhenUsed/>
+    <w:rsid w:val="00BD6BA3"/>
+    <w:rPr>
+      <w:sz w:val="16"/>
+      <w:szCs w:val="16"/>
+    </w:rPr>
+  </w:style>
+  <w:style w:type="paragraph" w:styleId="CommentText">
+    <w:name w:val="annotation text"/>
+    <w:basedOn w:val="Normal"/>
+    <w:link w:val="CommentTextChar"/>
+    <w:uiPriority w:val="99"/>
+    <w:unhideWhenUsed/>
+    <w:rsid w:val="00BD6BA3"/>
+    <w:rPr>
+      <w:sz w:val="20"/>
+      <w:szCs w:val="20"/>
+    </w:rPr>
+  </w:style>
+  <w:style w:type="character" w:customStyle="1" w:styleId="CommentTextChar">
+    <w:name w:val="Comment Text Char"/>
+    <w:basedOn w:val="DefaultParagraphFont"/>
+    <w:link w:val="CommentText"/>
+    <w:uiPriority w:val="99"/>
+    <w:rsid w:val="00BD6BA3"/>
+    <w:rPr>
+      <w:sz w:val="20"/>
+      <w:szCs w:val="20"/>
+    </w:rPr>
+  </w:style>
+  <w:style w:type="paragraph" w:styleId="CommentSubject">
+    <w:name w:val="annotation subject"/>
+    <w:basedOn w:val="CommentText"/>
+    <w:next w:val="CommentText"/>
+    <w:link w:val="CommentSubjectChar"/>
+    <w:uiPriority w:val="99"/>
+    <w:semiHidden/>
+    <w:unhideWhenUsed/>
+    <w:rsid w:val="00BD6BA3"/>
+    <w:rPr>
+      <w:b/>
+      <w:bCs/>
+    </w:rPr>
+  </w:style>
+  <w:style w:type="character" w:customStyle="1" w:styleId="CommentSubjectChar">
+    <w:name w:val="Comment Subject Char"/>
+    <w:basedOn w:val="CommentTextChar"/>
+    <w:link w:val="CommentSubject"/>
+    <w:uiPriority w:val="99"/>
+    <w:semiHidden/>
+    <w:rsid w:val="00BD6BA3"/>
+    <w:rPr>
+      <w:b/>
+      <w:bCs/>
+      <w:sz w:val="20"/>
+      <w:szCs w:val="20"/>
+    </w:rPr>
+  </w:style>
 </w:styles>
 </file>
 

</xml_diff>